<commit_message>
Created ecomm ERD, updated dash project notes, defined business questions, and started answerting ques in SQL
</commit_message>
<xml_diff>
--- a/documentation/nicosys-portfolio-operations-dash-documentation.docx
+++ b/documentation/nicosys-portfolio-operations-dash-documentation.docx
@@ -1,6 +1,6 @@
 
 <file path=word/document.xml><?xml version="1.0" encoding="utf-8"?>
-<w:document xmlns:wpc="http://schemas.microsoft.com/office/word/2010/wordprocessingCanvas" xmlns:cx="http://schemas.microsoft.com/office/drawing/2014/chartex" xmlns:cx1="http://schemas.microsoft.com/office/drawing/2015/9/8/chartex" xmlns:cx2="http://schemas.microsoft.com/office/drawing/2015/10/21/chartex" xmlns:cx3="http://schemas.microsoft.com/office/drawing/2016/5/9/chartex" xmlns:cx4="http://schemas.microsoft.com/office/drawing/2016/5/10/chartex" xmlns:cx5="http://schemas.microsoft.com/office/drawing/2016/5/11/chartex" xmlns:cx6="http://schemas.microsoft.com/office/drawing/2016/5/12/chartex" xmlns:cx7="http://schemas.microsoft.com/office/drawing/2016/5/13/chartex" xmlns:cx8="http://schemas.microsoft.com/office/drawing/2016/5/14/chartex" xmlns:mc="http://schemas.openxmlformats.org/markup-compatibility/2006" xmlns:aink="http://schemas.microsoft.com/office/drawing/2016/ink" xmlns:am3d="http://schemas.microsoft.com/office/drawing/2017/model3d" xmlns:o="urn:schemas-microsoft-com:office:office" xmlns:oel="http://schemas.microsoft.com/office/2019/extlst" xmlns:r="http://schemas.openxmlformats.org/officeDocument/2006/relationships" xmlns:m="http://schemas.openxmlformats.org/officeDocument/2006/math" xmlns:v="urn:schemas-microsoft-com:vml" xmlns:wp14="http://schemas.microsoft.com/office/word/2010/wordprocessingDrawing" xmlns:wp="http://schemas.openxmlformats.org/drawingml/2006/wordprocessingDrawing" xmlns:w10="urn:schemas-microsoft-com:office:word" xmlns:w="http://schemas.openxmlformats.org/wordprocessingml/2006/main" xmlns:w14="http://schemas.microsoft.com/office/word/2010/wordml" xmlns:w15="http://schemas.microsoft.com/office/word/2012/wordml" xmlns:w16cex="http://schemas.microsoft.com/office/word/2018/wordml/cex" xmlns:w16cid="http://schemas.microsoft.com/office/word/2016/wordml/cid" xmlns:w16="http://schemas.microsoft.com/office/word/2018/wordml" xmlns:w16du="http://schemas.microsoft.com/office/word/2023/wordml/word16du" xmlns:w16sdtdh="http://schemas.microsoft.com/office/word/2020/wordml/sdtdatahash" xmlns:w16sdtfl="http://schemas.microsoft.com/office/word/2024/wordml/sdtformatlock" xmlns:w16se="http://schemas.microsoft.com/office/word/2015/wordml/symex" xmlns:wpg="http://schemas.microsoft.com/office/word/2010/wordprocessingGroup" xmlns:wpi="http://schemas.microsoft.com/office/word/2010/wordprocessingInk" xmlns:wne="http://schemas.microsoft.com/office/word/2006/wordml" xmlns:wps="http://schemas.microsoft.com/office/word/2010/wordprocessingShape" mc:Ignorable="w14 w15 w16se w16cid w16 w16cex w16sdtdh w16sdtfl w16du wp14">
+<w:document xmlns:wpc="http://schemas.microsoft.com/office/word/2010/wordprocessingCanvas" xmlns:cx="http://schemas.microsoft.com/office/drawing/2014/chartex" xmlns:cx1="http://schemas.microsoft.com/office/drawing/2015/9/8/chartex" xmlns:cx2="http://schemas.microsoft.com/office/drawing/2015/10/21/chartex" xmlns:cx3="http://schemas.microsoft.com/office/drawing/2016/5/9/chartex" xmlns:cx4="http://schemas.microsoft.com/office/drawing/2016/5/10/chartex" xmlns:cx5="http://schemas.microsoft.com/office/drawing/2016/5/11/chartex" xmlns:cx6="http://schemas.microsoft.com/office/drawing/2016/5/12/chartex" xmlns:cx7="http://schemas.microsoft.com/office/drawing/2016/5/13/chartex" xmlns:cx8="http://schemas.microsoft.com/office/drawing/2016/5/14/chartex" xmlns:mc="http://schemas.openxmlformats.org/markup-compatibility/2006" xmlns:aink="http://schemas.microsoft.com/office/drawing/2016/ink" xmlns:am3d="http://schemas.microsoft.com/office/drawing/2017/model3d" xmlns:o="urn:schemas-microsoft-com:office:office" xmlns:oel="http://schemas.microsoft.com/office/2019/extlst" xmlns:r="http://schemas.openxmlformats.org/officeDocument/2006/relationships" xmlns:m="http://schemas.openxmlformats.org/officeDocument/2006/math" xmlns:v="urn:schemas-microsoft-com:vml" xmlns:wp14="http://schemas.microsoft.com/office/word/2010/wordprocessingDrawing" xmlns:wp="http://schemas.openxmlformats.org/drawingml/2006/wordprocessingDrawing" xmlns:w10="urn:schemas-microsoft-com:office:word" xmlns:w="http://schemas.openxmlformats.org/wordprocessingml/2006/main" xmlns:w14="http://schemas.microsoft.com/office/word/2010/wordml" xmlns:w15="http://schemas.microsoft.com/office/word/2012/wordml" xmlns:w16cei="http://schemas.microsoft.com/office/word/2026/wordml/cei" xmlns:w16cex="http://schemas.microsoft.com/office/word/2018/wordml/cex" xmlns:w16cid="http://schemas.microsoft.com/office/word/2016/wordml/cid" xmlns:w16="http://schemas.microsoft.com/office/word/2018/wordml" xmlns:w16du="http://schemas.microsoft.com/office/word/2023/wordml/word16du" xmlns:w16sdtdh="http://schemas.microsoft.com/office/word/2020/wordml/sdtdatahash" xmlns:w16sdtfl="http://schemas.microsoft.com/office/word/2024/wordml/sdtformatlock" xmlns:w16se="http://schemas.microsoft.com/office/word/2015/wordml/symex" xmlns:wpg="http://schemas.microsoft.com/office/word/2010/wordprocessingGroup" xmlns:wpi="http://schemas.microsoft.com/office/word/2010/wordprocessingInk" xmlns:wne="http://schemas.microsoft.com/office/word/2006/wordml" xmlns:wps="http://schemas.microsoft.com/office/word/2010/wordprocessingShape" mc:Ignorable="w14 w15 w16se w16cid w16 w16cex w16sdtdh w16sdtfl w16du wp14">
   <w:body>
     <w:p>
       <w:proofErr w:type="spellStart"/>
@@ -10,6 +10,360 @@
       <w:proofErr w:type="spellEnd"/>
       <w:r>
         <w:t xml:space="preserve"> Performance </w:t>
+      </w:r>
+    </w:p>
+    <w:p>
+      <w:pPr>
+        <w:rPr>
+          <w:u w:val="single"/>
+        </w:rPr>
+      </w:pPr>
+      <w:r>
+        <w:rPr>
+          <w:u w:val="single"/>
+        </w:rPr>
+        <w:t>7/2</w:t>
+      </w:r>
+      <w:r>
+        <w:rPr>
+          <w:u w:val="single"/>
+        </w:rPr>
+        <w:t>9</w:t>
+      </w:r>
+      <w:r>
+        <w:rPr>
+          <w:u w:val="single"/>
+        </w:rPr>
+        <w:t>/2026</w:t>
+      </w:r>
+    </w:p>
+    <w:p>
+      <w:pPr>
+        <w:pStyle w:val="ListParagraph"/>
+        <w:numPr>
+          <w:ilvl w:val="0"/>
+          <w:numId w:val="3"/>
+        </w:numPr>
+      </w:pPr>
+      <w:r>
+        <w:t>Defined business questions:</w:t>
+      </w:r>
+    </w:p>
+    <w:p>
+      <w:pPr>
+        <w:pStyle w:val="ListParagraph"/>
+        <w:numPr>
+          <w:ilvl w:val="1"/>
+          <w:numId w:val="3"/>
+        </w:numPr>
+      </w:pPr>
+      <w:r>
+        <w:t>How can I make more money with less hours dashing?</w:t>
+      </w:r>
+    </w:p>
+    <w:p>
+      <w:pPr>
+        <w:pStyle w:val="ListParagraph"/>
+        <w:numPr>
+          <w:ilvl w:val="2"/>
+          <w:numId w:val="3"/>
+        </w:numPr>
+      </w:pPr>
+      <w:r>
+        <w:t>What hours of the day do I make more money?</w:t>
+      </w:r>
+    </w:p>
+    <w:p>
+      <w:pPr>
+        <w:pStyle w:val="ListParagraph"/>
+        <w:numPr>
+          <w:ilvl w:val="3"/>
+          <w:numId w:val="3"/>
+        </w:numPr>
+      </w:pPr>
+      <w:r>
+        <w:t>What are my total earnings on average?</w:t>
+      </w:r>
+    </w:p>
+    <w:p>
+      <w:pPr>
+        <w:pStyle w:val="ListParagraph"/>
+        <w:numPr>
+          <w:ilvl w:val="2"/>
+          <w:numId w:val="3"/>
+        </w:numPr>
+      </w:pPr>
+      <w:r>
+        <w:t>How much money does each vendor bring in for me?</w:t>
+      </w:r>
+    </w:p>
+    <w:p>
+      <w:pPr>
+        <w:pStyle w:val="ListParagraph"/>
+        <w:numPr>
+          <w:ilvl w:val="3"/>
+          <w:numId w:val="3"/>
+        </w:numPr>
+      </w:pPr>
+      <w:r>
+        <w:t>Which vendors bring in the most money for me?</w:t>
+      </w:r>
+    </w:p>
+    <w:p>
+      <w:pPr>
+        <w:pStyle w:val="ListParagraph"/>
+        <w:numPr>
+          <w:ilvl w:val="2"/>
+          <w:numId w:val="3"/>
+        </w:numPr>
+      </w:pPr>
+      <w:r>
+        <w:t xml:space="preserve">Is there a </w:t>
+      </w:r>
+      <w:proofErr w:type="gramStart"/>
+      <w:r>
+        <w:t>criteria</w:t>
+      </w:r>
+      <w:proofErr w:type="gramEnd"/>
+      <w:r>
+        <w:t xml:space="preserve"> for accepting orders that make me better money? More money with less hours dashing?</w:t>
+      </w:r>
+    </w:p>
+    <w:p>
+      <w:pPr>
+        <w:pStyle w:val="ListParagraph"/>
+        <w:numPr>
+          <w:ilvl w:val="1"/>
+          <w:numId w:val="3"/>
+        </w:numPr>
+      </w:pPr>
+      <w:r>
+        <w:t>In SQL:</w:t>
+      </w:r>
+    </w:p>
+    <w:p>
+      <w:pPr>
+        <w:pStyle w:val="ListParagraph"/>
+        <w:numPr>
+          <w:ilvl w:val="2"/>
+          <w:numId w:val="3"/>
+        </w:numPr>
+      </w:pPr>
+      <w:r>
+        <w:t>What’s the most money I made in a day? Week?</w:t>
+      </w:r>
+    </w:p>
+    <w:p>
+      <w:pPr>
+        <w:pStyle w:val="ListParagraph"/>
+        <w:numPr>
+          <w:ilvl w:val="3"/>
+          <w:numId w:val="3"/>
+        </w:numPr>
+      </w:pPr>
+      <w:r>
+        <w:t xml:space="preserve">What are the compositions of those days? Can I/Should I repeat </w:t>
+      </w:r>
+      <w:proofErr w:type="gramStart"/>
+      <w:r>
+        <w:t>those type of days</w:t>
+      </w:r>
+      <w:proofErr w:type="gramEnd"/>
+      <w:r>
+        <w:t>; efficient to do so?</w:t>
+      </w:r>
+    </w:p>
+    <w:p>
+      <w:pPr>
+        <w:pStyle w:val="ListParagraph"/>
+        <w:numPr>
+          <w:ilvl w:val="2"/>
+          <w:numId w:val="3"/>
+        </w:numPr>
+      </w:pPr>
+      <w:r>
+        <w:t>What shifts make the most money?</w:t>
+      </w:r>
+    </w:p>
+    <w:p>
+      <w:pPr>
+        <w:pStyle w:val="ListParagraph"/>
+        <w:numPr>
+          <w:ilvl w:val="2"/>
+          <w:numId w:val="3"/>
+        </w:numPr>
+      </w:pPr>
+      <w:r>
+        <w:t>What is my avg, min, max $/mile?</w:t>
+      </w:r>
+    </w:p>
+    <w:p>
+      <w:pPr>
+        <w:pStyle w:val="ListParagraph"/>
+        <w:numPr>
+          <w:ilvl w:val="2"/>
+          <w:numId w:val="3"/>
+        </w:numPr>
+      </w:pPr>
+      <w:r>
+        <w:t>What order paid the highest?</w:t>
+      </w:r>
+    </w:p>
+    <w:p>
+      <w:pPr>
+        <w:pStyle w:val="ListParagraph"/>
+        <w:numPr>
+          <w:ilvl w:val="2"/>
+          <w:numId w:val="3"/>
+        </w:numPr>
+      </w:pPr>
+      <w:r>
+        <w:t>What orders are associated with making the most money overall?</w:t>
+      </w:r>
+    </w:p>
+    <w:p>
+      <w:pPr>
+        <w:pStyle w:val="ListParagraph"/>
+        <w:numPr>
+          <w:ilvl w:val="2"/>
+          <w:numId w:val="3"/>
+        </w:numPr>
+      </w:pPr>
+      <w:r>
+        <w:t xml:space="preserve">What </w:t>
+      </w:r>
+      <w:proofErr w:type="gramStart"/>
+      <w:r>
+        <w:t>is</w:t>
+      </w:r>
+      <w:proofErr w:type="gramEnd"/>
+      <w:r>
+        <w:t xml:space="preserve"> my </w:t>
+      </w:r>
+      <w:proofErr w:type="gramStart"/>
+      <w:r>
+        <w:t>average hours/</w:t>
+      </w:r>
+      <w:proofErr w:type="gramEnd"/>
+      <w:r>
+        <w:t>shift?</w:t>
+      </w:r>
+    </w:p>
+    <w:p>
+      <w:pPr>
+        <w:pStyle w:val="ListParagraph"/>
+        <w:numPr>
+          <w:ilvl w:val="2"/>
+          <w:numId w:val="3"/>
+        </w:numPr>
+      </w:pPr>
+      <w:r>
+        <w:t xml:space="preserve">Am I making </w:t>
+      </w:r>
+      <w:proofErr w:type="gramStart"/>
+      <w:r>
+        <w:t>more or less money</w:t>
+      </w:r>
+      <w:proofErr w:type="gramEnd"/>
+      <w:r>
+        <w:t xml:space="preserve"> with the same hours dashing?</w:t>
+      </w:r>
+    </w:p>
+    <w:p>
+      <w:pPr>
+        <w:pStyle w:val="ListParagraph"/>
+      </w:pPr>
+    </w:p>
+    <w:p>
+      <w:pPr>
+        <w:pStyle w:val="ListParagraph"/>
+        <w:numPr>
+          <w:ilvl w:val="0"/>
+          <w:numId w:val="3"/>
+        </w:numPr>
+        <w:rPr>
+          <w:b/>
+          <w:bCs/>
+        </w:rPr>
+      </w:pPr>
+      <w:r>
+        <w:rPr>
+          <w:b/>
+          <w:bCs/>
+        </w:rPr>
+        <w:t xml:space="preserve">Continue with Max and Min </w:t>
+      </w:r>
+      <w:proofErr w:type="gramStart"/>
+      <w:r>
+        <w:rPr>
+          <w:b/>
+          <w:bCs/>
+        </w:rPr>
+        <w:t>earnings, and</w:t>
+      </w:r>
+      <w:proofErr w:type="gramEnd"/>
+      <w:r>
+        <w:rPr>
+          <w:b/>
+          <w:bCs/>
+        </w:rPr>
+        <w:t xml:space="preserve"> then continue answering questions. </w:t>
+      </w:r>
+    </w:p>
+    <w:p>
+      <w:pPr>
+        <w:rPr>
+          <w:u w:val="single"/>
+        </w:rPr>
+      </w:pPr>
+    </w:p>
+    <w:p>
+      <w:pPr>
+        <w:rPr>
+          <w:u w:val="single"/>
+        </w:rPr>
+      </w:pPr>
+      <w:r>
+        <w:rPr>
+          <w:u w:val="single"/>
+        </w:rPr>
+        <w:t>7/28/2026</w:t>
+      </w:r>
+    </w:p>
+    <w:p>
+      <w:pPr>
+        <w:pStyle w:val="ListParagraph"/>
+        <w:numPr>
+          <w:ilvl w:val="0"/>
+          <w:numId w:val="2"/>
+        </w:numPr>
+      </w:pPr>
+      <w:r>
+        <w:t>Created ERD</w:t>
+      </w:r>
+    </w:p>
+    <w:p>
+      <w:pPr>
+        <w:pStyle w:val="ListParagraph"/>
+        <w:numPr>
+          <w:ilvl w:val="0"/>
+          <w:numId w:val="2"/>
+        </w:numPr>
+      </w:pPr>
+      <w:r>
+        <w:t>Created Table in PostgreSQL</w:t>
+      </w:r>
+    </w:p>
+    <w:p>
+      <w:pPr>
+        <w:pStyle w:val="ListParagraph"/>
+        <w:numPr>
+          <w:ilvl w:val="0"/>
+          <w:numId w:val="2"/>
+        </w:numPr>
+      </w:pPr>
+      <w:r>
+        <w:t>Updated .csv file and imported into PostgreSQL</w:t>
       </w:r>
     </w:p>
     <w:p>
@@ -95,8 +449,121 @@
 </file>
 
 <file path=word/numbering.xml><?xml version="1.0" encoding="utf-8"?>
-<w:numbering xmlns:wpc="http://schemas.microsoft.com/office/word/2010/wordprocessingCanvas" xmlns:cx="http://schemas.microsoft.com/office/drawing/2014/chartex" xmlns:cx1="http://schemas.microsoft.com/office/drawing/2015/9/8/chartex" xmlns:cx2="http://schemas.microsoft.com/office/drawing/2015/10/21/chartex" xmlns:cx3="http://schemas.microsoft.com/office/drawing/2016/5/9/chartex" xmlns:cx4="http://schemas.microsoft.com/office/drawing/2016/5/10/chartex" xmlns:cx5="http://schemas.microsoft.com/office/drawing/2016/5/11/chartex" xmlns:cx6="http://schemas.microsoft.com/office/drawing/2016/5/12/chartex" xmlns:cx7="http://schemas.microsoft.com/office/drawing/2016/5/13/chartex" xmlns:cx8="http://schemas.microsoft.com/office/drawing/2016/5/14/chartex" xmlns:mc="http://schemas.openxmlformats.org/markup-compatibility/2006" xmlns:aink="http://schemas.microsoft.com/office/drawing/2016/ink" xmlns:am3d="http://schemas.microsoft.com/office/drawing/2017/model3d" xmlns:o="urn:schemas-microsoft-com:office:office" xmlns:oel="http://schemas.microsoft.com/office/2019/extlst" xmlns:r="http://schemas.openxmlformats.org/officeDocument/2006/relationships" xmlns:m="http://schemas.openxmlformats.org/officeDocument/2006/math" xmlns:v="urn:schemas-microsoft-com:vml" xmlns:wp14="http://schemas.microsoft.com/office/word/2010/wordprocessingDrawing" xmlns:wp="http://schemas.openxmlformats.org/drawingml/2006/wordprocessingDrawing" xmlns:w10="urn:schemas-microsoft-com:office:word" xmlns:w="http://schemas.openxmlformats.org/wordprocessingml/2006/main" xmlns:w14="http://schemas.microsoft.com/office/word/2010/wordml" xmlns:w15="http://schemas.microsoft.com/office/word/2012/wordml" xmlns:w16cex="http://schemas.microsoft.com/office/word/2018/wordml/cex" xmlns:w16cid="http://schemas.microsoft.com/office/word/2016/wordml/cid" xmlns:w16="http://schemas.microsoft.com/office/word/2018/wordml" xmlns:w16du="http://schemas.microsoft.com/office/word/2023/wordml/word16du" xmlns:w16sdtdh="http://schemas.microsoft.com/office/word/2020/wordml/sdtdatahash" xmlns:w16sdtfl="http://schemas.microsoft.com/office/word/2024/wordml/sdtformatlock" xmlns:w16se="http://schemas.microsoft.com/office/word/2015/wordml/symex" xmlns:wpg="http://schemas.microsoft.com/office/word/2010/wordprocessingGroup" xmlns:wpi="http://schemas.microsoft.com/office/word/2010/wordprocessingInk" xmlns:wne="http://schemas.microsoft.com/office/word/2006/wordml" xmlns:wps="http://schemas.microsoft.com/office/word/2010/wordprocessingShape" mc:Ignorable="w14 w15 w16se w16cid w16 w16cex w16sdtdh w16sdtfl w16du wp14">
+<w:numbering xmlns:wpc="http://schemas.microsoft.com/office/word/2010/wordprocessingCanvas" xmlns:cx="http://schemas.microsoft.com/office/drawing/2014/chartex" xmlns:cx1="http://schemas.microsoft.com/office/drawing/2015/9/8/chartex" xmlns:cx2="http://schemas.microsoft.com/office/drawing/2015/10/21/chartex" xmlns:cx3="http://schemas.microsoft.com/office/drawing/2016/5/9/chartex" xmlns:cx4="http://schemas.microsoft.com/office/drawing/2016/5/10/chartex" xmlns:cx5="http://schemas.microsoft.com/office/drawing/2016/5/11/chartex" xmlns:cx6="http://schemas.microsoft.com/office/drawing/2016/5/12/chartex" xmlns:cx7="http://schemas.microsoft.com/office/drawing/2016/5/13/chartex" xmlns:cx8="http://schemas.microsoft.com/office/drawing/2016/5/14/chartex" xmlns:mc="http://schemas.openxmlformats.org/markup-compatibility/2006" xmlns:aink="http://schemas.microsoft.com/office/drawing/2016/ink" xmlns:am3d="http://schemas.microsoft.com/office/drawing/2017/model3d" xmlns:o="urn:schemas-microsoft-com:office:office" xmlns:oel="http://schemas.microsoft.com/office/2019/extlst" xmlns:r="http://schemas.openxmlformats.org/officeDocument/2006/relationships" xmlns:m="http://schemas.openxmlformats.org/officeDocument/2006/math" xmlns:v="urn:schemas-microsoft-com:vml" xmlns:wp14="http://schemas.microsoft.com/office/word/2010/wordprocessingDrawing" xmlns:wp="http://schemas.openxmlformats.org/drawingml/2006/wordprocessingDrawing" xmlns:w10="urn:schemas-microsoft-com:office:word" xmlns:w="http://schemas.openxmlformats.org/wordprocessingml/2006/main" xmlns:w14="http://schemas.microsoft.com/office/word/2010/wordml" xmlns:w15="http://schemas.microsoft.com/office/word/2012/wordml" xmlns:w16cei="http://schemas.microsoft.com/office/word/2026/wordml/cei" xmlns:w16cex="http://schemas.microsoft.com/office/word/2018/wordml/cex" xmlns:w16cid="http://schemas.microsoft.com/office/word/2016/wordml/cid" xmlns:w16="http://schemas.microsoft.com/office/word/2018/wordml" xmlns:w16du="http://schemas.microsoft.com/office/word/2023/wordml/word16du" xmlns:w16sdtdh="http://schemas.microsoft.com/office/word/2020/wordml/sdtdatahash" xmlns:w16sdtfl="http://schemas.microsoft.com/office/word/2024/wordml/sdtformatlock" xmlns:w16se="http://schemas.microsoft.com/office/word/2015/wordml/symex" xmlns:wpg="http://schemas.microsoft.com/office/word/2010/wordprocessingGroup" xmlns:wpi="http://schemas.microsoft.com/office/word/2010/wordprocessingInk" xmlns:wne="http://schemas.microsoft.com/office/word/2006/wordml" xmlns:wps="http://schemas.microsoft.com/office/word/2010/wordprocessingShape" mc:Ignorable="w14 w15 w16se w16cid w16 w16cex w16sdtdh w16sdtfl w16du wp14">
   <w:abstractNum w:abstractNumId="0" w15:restartNumberingAfterBreak="0">
+    <w:nsid w:val="516F60DE"/>
+    <w:multiLevelType w:val="hybridMultilevel"/>
+    <w:tmpl w:val="E744E2EA"/>
+    <w:lvl w:ilvl="0" w:tplc="0409000D">
+      <w:start w:val="1"/>
+      <w:numFmt w:val="bullet"/>
+      <w:lvlText w:val=""/>
+      <w:lvlJc w:val="left"/>
+      <w:pPr>
+        <w:ind w:left="720" w:hanging="360"/>
+      </w:pPr>
+      <w:rPr>
+        <w:rFonts w:ascii="Wingdings" w:hAnsi="Wingdings" w:hint="default"/>
+      </w:rPr>
+    </w:lvl>
+    <w:lvl w:ilvl="1" w:tplc="04090003" w:tentative="1">
+      <w:start w:val="1"/>
+      <w:numFmt w:val="bullet"/>
+      <w:lvlText w:val="o"/>
+      <w:lvlJc w:val="left"/>
+      <w:pPr>
+        <w:ind w:left="1440" w:hanging="360"/>
+      </w:pPr>
+      <w:rPr>
+        <w:rFonts w:ascii="Courier New" w:hAnsi="Courier New" w:cs="Courier New" w:hint="default"/>
+      </w:rPr>
+    </w:lvl>
+    <w:lvl w:ilvl="2" w:tplc="04090005" w:tentative="1">
+      <w:start w:val="1"/>
+      <w:numFmt w:val="bullet"/>
+      <w:lvlText w:val=""/>
+      <w:lvlJc w:val="left"/>
+      <w:pPr>
+        <w:ind w:left="2160" w:hanging="360"/>
+      </w:pPr>
+      <w:rPr>
+        <w:rFonts w:ascii="Wingdings" w:hAnsi="Wingdings" w:hint="default"/>
+      </w:rPr>
+    </w:lvl>
+    <w:lvl w:ilvl="3" w:tplc="04090001" w:tentative="1">
+      <w:start w:val="1"/>
+      <w:numFmt w:val="bullet"/>
+      <w:lvlText w:val=""/>
+      <w:lvlJc w:val="left"/>
+      <w:pPr>
+        <w:ind w:left="2880" w:hanging="360"/>
+      </w:pPr>
+      <w:rPr>
+        <w:rFonts w:ascii="Symbol" w:hAnsi="Symbol" w:hint="default"/>
+      </w:rPr>
+    </w:lvl>
+    <w:lvl w:ilvl="4" w:tplc="04090003" w:tentative="1">
+      <w:start w:val="1"/>
+      <w:numFmt w:val="bullet"/>
+      <w:lvlText w:val="o"/>
+      <w:lvlJc w:val="left"/>
+      <w:pPr>
+        <w:ind w:left="3600" w:hanging="360"/>
+      </w:pPr>
+      <w:rPr>
+        <w:rFonts w:ascii="Courier New" w:hAnsi="Courier New" w:cs="Courier New" w:hint="default"/>
+      </w:rPr>
+    </w:lvl>
+    <w:lvl w:ilvl="5" w:tplc="04090005" w:tentative="1">
+      <w:start w:val="1"/>
+      <w:numFmt w:val="bullet"/>
+      <w:lvlText w:val=""/>
+      <w:lvlJc w:val="left"/>
+      <w:pPr>
+        <w:ind w:left="4320" w:hanging="360"/>
+      </w:pPr>
+      <w:rPr>
+        <w:rFonts w:ascii="Wingdings" w:hAnsi="Wingdings" w:hint="default"/>
+      </w:rPr>
+    </w:lvl>
+    <w:lvl w:ilvl="6" w:tplc="04090001" w:tentative="1">
+      <w:start w:val="1"/>
+      <w:numFmt w:val="bullet"/>
+      <w:lvlText w:val=""/>
+      <w:lvlJc w:val="left"/>
+      <w:pPr>
+        <w:ind w:left="5040" w:hanging="360"/>
+      </w:pPr>
+      <w:rPr>
+        <w:rFonts w:ascii="Symbol" w:hAnsi="Symbol" w:hint="default"/>
+      </w:rPr>
+    </w:lvl>
+    <w:lvl w:ilvl="7" w:tplc="04090003" w:tentative="1">
+      <w:start w:val="1"/>
+      <w:numFmt w:val="bullet"/>
+      <w:lvlText w:val="o"/>
+      <w:lvlJc w:val="left"/>
+      <w:pPr>
+        <w:ind w:left="5760" w:hanging="360"/>
+      </w:pPr>
+      <w:rPr>
+        <w:rFonts w:ascii="Courier New" w:hAnsi="Courier New" w:cs="Courier New" w:hint="default"/>
+      </w:rPr>
+    </w:lvl>
+    <w:lvl w:ilvl="8" w:tplc="04090005" w:tentative="1">
+      <w:start w:val="1"/>
+      <w:numFmt w:val="bullet"/>
+      <w:lvlText w:val=""/>
+      <w:lvlJc w:val="left"/>
+      <w:pPr>
+        <w:ind w:left="6480" w:hanging="360"/>
+      </w:pPr>
+      <w:rPr>
+        <w:rFonts w:ascii="Wingdings" w:hAnsi="Wingdings" w:hint="default"/>
+      </w:rPr>
+    </w:lvl>
+  </w:abstractNum>
+  <w:abstractNum w:abstractNumId="1" w15:restartNumberingAfterBreak="0">
     <w:nsid w:val="6FE279BA"/>
     <w:multiLevelType w:val="hybridMultilevel"/>
     <w:tmpl w:val="5D3A03EC"/>
@@ -209,8 +676,127 @@
       </w:rPr>
     </w:lvl>
   </w:abstractNum>
+  <w:abstractNum w:abstractNumId="2" w15:restartNumberingAfterBreak="0">
+    <w:nsid w:val="724C22D9"/>
+    <w:multiLevelType w:val="hybridMultilevel"/>
+    <w:tmpl w:val="2A66E762"/>
+    <w:lvl w:ilvl="0" w:tplc="0409000D">
+      <w:start w:val="1"/>
+      <w:numFmt w:val="bullet"/>
+      <w:lvlText w:val=""/>
+      <w:lvlJc w:val="left"/>
+      <w:pPr>
+        <w:ind w:left="720" w:hanging="360"/>
+      </w:pPr>
+      <w:rPr>
+        <w:rFonts w:ascii="Wingdings" w:hAnsi="Wingdings" w:hint="default"/>
+      </w:rPr>
+    </w:lvl>
+    <w:lvl w:ilvl="1" w:tplc="04090003">
+      <w:start w:val="1"/>
+      <w:numFmt w:val="bullet"/>
+      <w:lvlText w:val="o"/>
+      <w:lvlJc w:val="left"/>
+      <w:pPr>
+        <w:ind w:left="1440" w:hanging="360"/>
+      </w:pPr>
+      <w:rPr>
+        <w:rFonts w:ascii="Courier New" w:hAnsi="Courier New" w:cs="Courier New" w:hint="default"/>
+      </w:rPr>
+    </w:lvl>
+    <w:lvl w:ilvl="2" w:tplc="04090005">
+      <w:start w:val="1"/>
+      <w:numFmt w:val="bullet"/>
+      <w:lvlText w:val=""/>
+      <w:lvlJc w:val="left"/>
+      <w:pPr>
+        <w:ind w:left="2160" w:hanging="360"/>
+      </w:pPr>
+      <w:rPr>
+        <w:rFonts w:ascii="Wingdings" w:hAnsi="Wingdings" w:hint="default"/>
+      </w:rPr>
+    </w:lvl>
+    <w:lvl w:ilvl="3" w:tplc="04090001">
+      <w:start w:val="1"/>
+      <w:numFmt w:val="bullet"/>
+      <w:lvlText w:val=""/>
+      <w:lvlJc w:val="left"/>
+      <w:pPr>
+        <w:ind w:left="2880" w:hanging="360"/>
+      </w:pPr>
+      <w:rPr>
+        <w:rFonts w:ascii="Symbol" w:hAnsi="Symbol" w:hint="default"/>
+      </w:rPr>
+    </w:lvl>
+    <w:lvl w:ilvl="4" w:tplc="04090003">
+      <w:start w:val="1"/>
+      <w:numFmt w:val="bullet"/>
+      <w:lvlText w:val="o"/>
+      <w:lvlJc w:val="left"/>
+      <w:pPr>
+        <w:ind w:left="3600" w:hanging="360"/>
+      </w:pPr>
+      <w:rPr>
+        <w:rFonts w:ascii="Courier New" w:hAnsi="Courier New" w:cs="Courier New" w:hint="default"/>
+      </w:rPr>
+    </w:lvl>
+    <w:lvl w:ilvl="5" w:tplc="04090005" w:tentative="1">
+      <w:start w:val="1"/>
+      <w:numFmt w:val="bullet"/>
+      <w:lvlText w:val=""/>
+      <w:lvlJc w:val="left"/>
+      <w:pPr>
+        <w:ind w:left="4320" w:hanging="360"/>
+      </w:pPr>
+      <w:rPr>
+        <w:rFonts w:ascii="Wingdings" w:hAnsi="Wingdings" w:hint="default"/>
+      </w:rPr>
+    </w:lvl>
+    <w:lvl w:ilvl="6" w:tplc="04090001" w:tentative="1">
+      <w:start w:val="1"/>
+      <w:numFmt w:val="bullet"/>
+      <w:lvlText w:val=""/>
+      <w:lvlJc w:val="left"/>
+      <w:pPr>
+        <w:ind w:left="5040" w:hanging="360"/>
+      </w:pPr>
+      <w:rPr>
+        <w:rFonts w:ascii="Symbol" w:hAnsi="Symbol" w:hint="default"/>
+      </w:rPr>
+    </w:lvl>
+    <w:lvl w:ilvl="7" w:tplc="04090003" w:tentative="1">
+      <w:start w:val="1"/>
+      <w:numFmt w:val="bullet"/>
+      <w:lvlText w:val="o"/>
+      <w:lvlJc w:val="left"/>
+      <w:pPr>
+        <w:ind w:left="5760" w:hanging="360"/>
+      </w:pPr>
+      <w:rPr>
+        <w:rFonts w:ascii="Courier New" w:hAnsi="Courier New" w:cs="Courier New" w:hint="default"/>
+      </w:rPr>
+    </w:lvl>
+    <w:lvl w:ilvl="8" w:tplc="04090005" w:tentative="1">
+      <w:start w:val="1"/>
+      <w:numFmt w:val="bullet"/>
+      <w:lvlText w:val=""/>
+      <w:lvlJc w:val="left"/>
+      <w:pPr>
+        <w:ind w:left="6480" w:hanging="360"/>
+      </w:pPr>
+      <w:rPr>
+        <w:rFonts w:ascii="Wingdings" w:hAnsi="Wingdings" w:hint="default"/>
+      </w:rPr>
+    </w:lvl>
+  </w:abstractNum>
   <w:num w:numId="1" w16cid:durableId="512917471">
+    <w:abstractNumId w:val="1"/>
+  </w:num>
+  <w:num w:numId="2" w16cid:durableId="1753311224">
     <w:abstractNumId w:val="0"/>
+  </w:num>
+  <w:num w:numId="3" w16cid:durableId="1444612632">
+    <w:abstractNumId w:val="2"/>
   </w:num>
 </w:numbering>
 </file>

</xml_diff>

<commit_message>
Updated ecom project documentation
</commit_message>
<xml_diff>
--- a/documentation/nicosys-portfolio-operations-dash-documentation.docx
+++ b/documentation/nicosys-portfolio-operations-dash-documentation.docx
@@ -3,13 +3,8 @@
 <w:document xmlns:wpc="http://schemas.microsoft.com/office/word/2010/wordprocessingCanvas" xmlns:cx="http://schemas.microsoft.com/office/drawing/2014/chartex" xmlns:cx1="http://schemas.microsoft.com/office/drawing/2015/9/8/chartex" xmlns:cx2="http://schemas.microsoft.com/office/drawing/2015/10/21/chartex" xmlns:cx3="http://schemas.microsoft.com/office/drawing/2016/5/9/chartex" xmlns:cx4="http://schemas.microsoft.com/office/drawing/2016/5/10/chartex" xmlns:cx5="http://schemas.microsoft.com/office/drawing/2016/5/11/chartex" xmlns:cx6="http://schemas.microsoft.com/office/drawing/2016/5/12/chartex" xmlns:cx7="http://schemas.microsoft.com/office/drawing/2016/5/13/chartex" xmlns:cx8="http://schemas.microsoft.com/office/drawing/2016/5/14/chartex" xmlns:mc="http://schemas.openxmlformats.org/markup-compatibility/2006" xmlns:aink="http://schemas.microsoft.com/office/drawing/2016/ink" xmlns:am3d="http://schemas.microsoft.com/office/drawing/2017/model3d" xmlns:o="urn:schemas-microsoft-com:office:office" xmlns:oel="http://schemas.microsoft.com/office/2019/extlst" xmlns:r="http://schemas.openxmlformats.org/officeDocument/2006/relationships" xmlns:m="http://schemas.openxmlformats.org/officeDocument/2006/math" xmlns:v="urn:schemas-microsoft-com:vml" xmlns:wp14="http://schemas.microsoft.com/office/word/2010/wordprocessingDrawing" xmlns:wp="http://schemas.openxmlformats.org/drawingml/2006/wordprocessingDrawing" xmlns:w10="urn:schemas-microsoft-com:office:word" xmlns:w="http://schemas.openxmlformats.org/wordprocessingml/2006/main" xmlns:w14="http://schemas.microsoft.com/office/word/2010/wordml" xmlns:w15="http://schemas.microsoft.com/office/word/2012/wordml" xmlns:w16cei="http://schemas.microsoft.com/office/word/2026/wordml/cei" xmlns:w16cex="http://schemas.microsoft.com/office/word/2018/wordml/cex" xmlns:w16cid="http://schemas.microsoft.com/office/word/2016/wordml/cid" xmlns:w16="http://schemas.microsoft.com/office/word/2018/wordml" xmlns:w16du="http://schemas.microsoft.com/office/word/2023/wordml/word16du" xmlns:w16sdtdh="http://schemas.microsoft.com/office/word/2020/wordml/sdtdatahash" xmlns:w16sdtfl="http://schemas.microsoft.com/office/word/2024/wordml/sdtformatlock" xmlns:w16se="http://schemas.microsoft.com/office/word/2015/wordml/symex" xmlns:wpg="http://schemas.microsoft.com/office/word/2010/wordprocessingGroup" xmlns:wpi="http://schemas.microsoft.com/office/word/2010/wordprocessingInk" xmlns:wne="http://schemas.microsoft.com/office/word/2006/wordml" xmlns:wps="http://schemas.microsoft.com/office/word/2010/wordprocessingShape" mc:Ignorable="w14 w15 w16se w16cid w16 w16cex w16sdtdh w16sdtfl w16du wp14">
   <w:body>
     <w:p>
-      <w:proofErr w:type="spellStart"/>
-      <w:r>
-        <w:t>Doordash</w:t>
-      </w:r>
-      <w:proofErr w:type="spellEnd"/>
-      <w:r>
-        <w:t xml:space="preserve"> Performance </w:t>
+      <w:r>
+        <w:t xml:space="preserve">Doordash Performance </w:t>
       </w:r>
     </w:p>
     <w:p>
@@ -22,257 +17,8 @@
         <w:rPr>
           <w:u w:val="single"/>
         </w:rPr>
-        <w:t>7/2</w:t>
-      </w:r>
-      <w:r>
-        <w:rPr>
-          <w:u w:val="single"/>
-        </w:rPr>
-        <w:t>9</w:t>
-      </w:r>
-      <w:r>
-        <w:rPr>
-          <w:u w:val="single"/>
-        </w:rPr>
-        <w:t>/2026</w:t>
-      </w:r>
-    </w:p>
-    <w:p>
-      <w:pPr>
-        <w:pStyle w:val="ListParagraph"/>
-        <w:numPr>
-          <w:ilvl w:val="0"/>
-          <w:numId w:val="3"/>
-        </w:numPr>
-      </w:pPr>
-      <w:r>
-        <w:t>Defined business questions:</w:t>
-      </w:r>
-    </w:p>
-    <w:p>
-      <w:pPr>
-        <w:pStyle w:val="ListParagraph"/>
-        <w:numPr>
-          <w:ilvl w:val="1"/>
-          <w:numId w:val="3"/>
-        </w:numPr>
-      </w:pPr>
-      <w:r>
-        <w:t>How can I make more money with less hours dashing?</w:t>
-      </w:r>
-    </w:p>
-    <w:p>
-      <w:pPr>
-        <w:pStyle w:val="ListParagraph"/>
-        <w:numPr>
-          <w:ilvl w:val="2"/>
-          <w:numId w:val="3"/>
-        </w:numPr>
-      </w:pPr>
-      <w:r>
-        <w:t>What hours of the day do I make more money?</w:t>
-      </w:r>
-    </w:p>
-    <w:p>
-      <w:pPr>
-        <w:pStyle w:val="ListParagraph"/>
-        <w:numPr>
-          <w:ilvl w:val="3"/>
-          <w:numId w:val="3"/>
-        </w:numPr>
-      </w:pPr>
-      <w:r>
-        <w:t>What are my total earnings on average?</w:t>
-      </w:r>
-    </w:p>
-    <w:p>
-      <w:pPr>
-        <w:pStyle w:val="ListParagraph"/>
-        <w:numPr>
-          <w:ilvl w:val="2"/>
-          <w:numId w:val="3"/>
-        </w:numPr>
-      </w:pPr>
-      <w:r>
-        <w:t>How much money does each vendor bring in for me?</w:t>
-      </w:r>
-    </w:p>
-    <w:p>
-      <w:pPr>
-        <w:pStyle w:val="ListParagraph"/>
-        <w:numPr>
-          <w:ilvl w:val="3"/>
-          <w:numId w:val="3"/>
-        </w:numPr>
-      </w:pPr>
-      <w:r>
-        <w:t>Which vendors bring in the most money for me?</w:t>
-      </w:r>
-    </w:p>
-    <w:p>
-      <w:pPr>
-        <w:pStyle w:val="ListParagraph"/>
-        <w:numPr>
-          <w:ilvl w:val="2"/>
-          <w:numId w:val="3"/>
-        </w:numPr>
-      </w:pPr>
-      <w:r>
-        <w:t xml:space="preserve">Is there a </w:t>
-      </w:r>
-      <w:proofErr w:type="gramStart"/>
-      <w:r>
-        <w:t>criteria</w:t>
-      </w:r>
-      <w:proofErr w:type="gramEnd"/>
-      <w:r>
-        <w:t xml:space="preserve"> for accepting orders that make me better money? More money with less hours dashing?</w:t>
-      </w:r>
-    </w:p>
-    <w:p>
-      <w:pPr>
-        <w:pStyle w:val="ListParagraph"/>
-        <w:numPr>
-          <w:ilvl w:val="1"/>
-          <w:numId w:val="3"/>
-        </w:numPr>
-      </w:pPr>
-      <w:r>
-        <w:t>In SQL:</w:t>
-      </w:r>
-    </w:p>
-    <w:p>
-      <w:pPr>
-        <w:pStyle w:val="ListParagraph"/>
-        <w:numPr>
-          <w:ilvl w:val="2"/>
-          <w:numId w:val="3"/>
-        </w:numPr>
-      </w:pPr>
-      <w:r>
-        <w:t>What’s the most money I made in a day? Week?</w:t>
-      </w:r>
-    </w:p>
-    <w:p>
-      <w:pPr>
-        <w:pStyle w:val="ListParagraph"/>
-        <w:numPr>
-          <w:ilvl w:val="3"/>
-          <w:numId w:val="3"/>
-        </w:numPr>
-      </w:pPr>
-      <w:r>
-        <w:t xml:space="preserve">What are the compositions of those days? Can I/Should I repeat </w:t>
-      </w:r>
-      <w:proofErr w:type="gramStart"/>
-      <w:r>
-        <w:t>those type of days</w:t>
-      </w:r>
-      <w:proofErr w:type="gramEnd"/>
-      <w:r>
-        <w:t>; efficient to do so?</w:t>
-      </w:r>
-    </w:p>
-    <w:p>
-      <w:pPr>
-        <w:pStyle w:val="ListParagraph"/>
-        <w:numPr>
-          <w:ilvl w:val="2"/>
-          <w:numId w:val="3"/>
-        </w:numPr>
-      </w:pPr>
-      <w:r>
-        <w:t>What shifts make the most money?</w:t>
-      </w:r>
-    </w:p>
-    <w:p>
-      <w:pPr>
-        <w:pStyle w:val="ListParagraph"/>
-        <w:numPr>
-          <w:ilvl w:val="2"/>
-          <w:numId w:val="3"/>
-        </w:numPr>
-      </w:pPr>
-      <w:r>
-        <w:t>What is my avg, min, max $/mile?</w:t>
-      </w:r>
-    </w:p>
-    <w:p>
-      <w:pPr>
-        <w:pStyle w:val="ListParagraph"/>
-        <w:numPr>
-          <w:ilvl w:val="2"/>
-          <w:numId w:val="3"/>
-        </w:numPr>
-      </w:pPr>
-      <w:r>
-        <w:t>What order paid the highest?</w:t>
-      </w:r>
-    </w:p>
-    <w:p>
-      <w:pPr>
-        <w:pStyle w:val="ListParagraph"/>
-        <w:numPr>
-          <w:ilvl w:val="2"/>
-          <w:numId w:val="3"/>
-        </w:numPr>
-      </w:pPr>
-      <w:r>
-        <w:t>What orders are associated with making the most money overall?</w:t>
-      </w:r>
-    </w:p>
-    <w:p>
-      <w:pPr>
-        <w:pStyle w:val="ListParagraph"/>
-        <w:numPr>
-          <w:ilvl w:val="2"/>
-          <w:numId w:val="3"/>
-        </w:numPr>
-      </w:pPr>
-      <w:r>
-        <w:t xml:space="preserve">What </w:t>
-      </w:r>
-      <w:proofErr w:type="gramStart"/>
-      <w:r>
-        <w:t>is</w:t>
-      </w:r>
-      <w:proofErr w:type="gramEnd"/>
-      <w:r>
-        <w:t xml:space="preserve"> my </w:t>
-      </w:r>
-      <w:proofErr w:type="gramStart"/>
-      <w:r>
-        <w:t>average hours/</w:t>
-      </w:r>
-      <w:proofErr w:type="gramEnd"/>
-      <w:r>
-        <w:t>shift?</w:t>
-      </w:r>
-    </w:p>
-    <w:p>
-      <w:pPr>
-        <w:pStyle w:val="ListParagraph"/>
-        <w:numPr>
-          <w:ilvl w:val="2"/>
-          <w:numId w:val="3"/>
-        </w:numPr>
-      </w:pPr>
-      <w:r>
-        <w:t xml:space="preserve">Am I making </w:t>
-      </w:r>
-      <w:proofErr w:type="gramStart"/>
-      <w:r>
-        <w:t>more or less money</w:t>
-      </w:r>
-      <w:proofErr w:type="gramEnd"/>
-      <w:r>
-        <w:t xml:space="preserve"> with the same hours dashing?</w:t>
-      </w:r>
-    </w:p>
-    <w:p>
-      <w:pPr>
-        <w:pStyle w:val="ListParagraph"/>
-      </w:pPr>
+        <w:t>7/30/2026</w:t>
+      </w:r>
     </w:p>
     <w:p>
       <w:pPr>
@@ -291,24 +37,339 @@
           <w:b/>
           <w:bCs/>
         </w:rPr>
-        <w:t xml:space="preserve">Continue with Max and Min </w:t>
-      </w:r>
-      <w:proofErr w:type="gramStart"/>
+        <w:t xml:space="preserve">Continue with Max and Min earnings, and then continue answering </w:t>
+      </w:r>
       <w:r>
         <w:rPr>
           <w:b/>
           <w:bCs/>
         </w:rPr>
-        <w:t>earnings, and</w:t>
-      </w:r>
-      <w:proofErr w:type="gramEnd"/>
+        <w:t xml:space="preserve">the rest of </w:t>
+      </w:r>
       <w:r>
         <w:rPr>
           <w:b/>
           <w:bCs/>
         </w:rPr>
-        <w:t xml:space="preserve"> then continue answering questions. </w:t>
-      </w:r>
+        <w:t xml:space="preserve">questions. </w:t>
+      </w:r>
+    </w:p>
+    <w:p>
+      <w:pPr>
+        <w:ind w:left="360"/>
+      </w:pPr>
+      <w:r>
+        <w:t xml:space="preserve">What remains: </w:t>
+      </w:r>
+    </w:p>
+    <w:p>
+      <w:pPr>
+        <w:pStyle w:val="ListParagraph"/>
+        <w:numPr>
+          <w:ilvl w:val="0"/>
+          <w:numId w:val="4"/>
+        </w:numPr>
+      </w:pPr>
+      <w:r>
+        <w:t>Validating SQL results in Excel</w:t>
+      </w:r>
+    </w:p>
+    <w:p>
+      <w:pPr>
+        <w:pStyle w:val="ListParagraph"/>
+        <w:numPr>
+          <w:ilvl w:val="0"/>
+          <w:numId w:val="4"/>
+        </w:numPr>
+      </w:pPr>
+      <w:r>
+        <w:t xml:space="preserve">Report findings in power BI with graphs, charts, and executive summary </w:t>
+      </w:r>
+    </w:p>
+    <w:p>
+      <w:r>
+        <w:t>Then go back to entire portfolio:</w:t>
+      </w:r>
+    </w:p>
+    <w:p>
+      <w:pPr>
+        <w:pStyle w:val="ListParagraph"/>
+        <w:numPr>
+          <w:ilvl w:val="0"/>
+          <w:numId w:val="5"/>
+        </w:numPr>
+      </w:pPr>
+      <w:r>
+        <w:t>Update all README.md files to ensure clarity and accuracy with final project results.</w:t>
+      </w:r>
+    </w:p>
+    <w:p>
+      <w:pPr>
+        <w:pStyle w:val="ListParagraph"/>
+        <w:numPr>
+          <w:ilvl w:val="0"/>
+          <w:numId w:val="5"/>
+        </w:numPr>
+      </w:pPr>
+      <w:r>
+        <w:t>Have PDFs of each of the three PowerBi projects/files</w:t>
+      </w:r>
+    </w:p>
+    <w:p>
+      <w:pPr>
+        <w:pStyle w:val="ListParagraph"/>
+        <w:numPr>
+          <w:ilvl w:val="0"/>
+          <w:numId w:val="5"/>
+        </w:numPr>
+      </w:pPr>
+      <w:r>
+        <w:t xml:space="preserve">Create canva and powerpoint presentations on each project </w:t>
+      </w:r>
+    </w:p>
+    <w:p>
+      <w:pPr>
+        <w:pStyle w:val="ListParagraph"/>
+        <w:numPr>
+          <w:ilvl w:val="0"/>
+          <w:numId w:val="5"/>
+        </w:numPr>
+      </w:pPr>
+      <w:r>
+        <w:t xml:space="preserve">Update resume with GitHub and Canva links </w:t>
+      </w:r>
+    </w:p>
+    <w:p>
+      <w:pPr>
+        <w:pStyle w:val="ListParagraph"/>
+        <w:numPr>
+          <w:ilvl w:val="0"/>
+          <w:numId w:val="5"/>
+        </w:numPr>
+      </w:pPr>
+      <w:r>
+        <w:t xml:space="preserve">Update LinkedIn with new resume, </w:t>
+      </w:r>
+      <w:r>
+        <w:t>GitHub and Canva links</w:t>
+      </w:r>
+    </w:p>
+    <w:p>
+      <w:r>
+        <w:t>Then move into Next Phase: Applying, Learning, and Continuing to Build</w:t>
+      </w:r>
+    </w:p>
+    <w:p/>
+    <w:p>
+      <w:pPr>
+        <w:rPr>
+          <w:u w:val="single"/>
+        </w:rPr>
+      </w:pPr>
+      <w:r>
+        <w:rPr>
+          <w:u w:val="single"/>
+        </w:rPr>
+        <w:t>7/29/2026</w:t>
+      </w:r>
+    </w:p>
+    <w:p>
+      <w:pPr>
+        <w:pStyle w:val="ListParagraph"/>
+        <w:numPr>
+          <w:ilvl w:val="0"/>
+          <w:numId w:val="3"/>
+        </w:numPr>
+      </w:pPr>
+      <w:r>
+        <w:t>Defined business questions:</w:t>
+      </w:r>
+    </w:p>
+    <w:p>
+      <w:pPr>
+        <w:pStyle w:val="ListParagraph"/>
+        <w:numPr>
+          <w:ilvl w:val="1"/>
+          <w:numId w:val="3"/>
+        </w:numPr>
+      </w:pPr>
+      <w:r>
+        <w:t>How can I make more money with less hours dashing?</w:t>
+      </w:r>
+    </w:p>
+    <w:p>
+      <w:pPr>
+        <w:pStyle w:val="ListParagraph"/>
+        <w:numPr>
+          <w:ilvl w:val="2"/>
+          <w:numId w:val="3"/>
+        </w:numPr>
+      </w:pPr>
+      <w:r>
+        <w:t>What hours of the day do I make more money?</w:t>
+      </w:r>
+    </w:p>
+    <w:p>
+      <w:pPr>
+        <w:pStyle w:val="ListParagraph"/>
+        <w:numPr>
+          <w:ilvl w:val="3"/>
+          <w:numId w:val="3"/>
+        </w:numPr>
+      </w:pPr>
+      <w:r>
+        <w:t>What are my total earnings on average?</w:t>
+      </w:r>
+    </w:p>
+    <w:p>
+      <w:pPr>
+        <w:pStyle w:val="ListParagraph"/>
+        <w:numPr>
+          <w:ilvl w:val="2"/>
+          <w:numId w:val="3"/>
+        </w:numPr>
+      </w:pPr>
+      <w:r>
+        <w:t>How much money does each vendor bring in for me?</w:t>
+      </w:r>
+    </w:p>
+    <w:p>
+      <w:pPr>
+        <w:pStyle w:val="ListParagraph"/>
+        <w:numPr>
+          <w:ilvl w:val="3"/>
+          <w:numId w:val="3"/>
+        </w:numPr>
+      </w:pPr>
+      <w:r>
+        <w:t>Which vendors bring in the most money for me?</w:t>
+      </w:r>
+    </w:p>
+    <w:p>
+      <w:pPr>
+        <w:pStyle w:val="ListParagraph"/>
+        <w:numPr>
+          <w:ilvl w:val="2"/>
+          <w:numId w:val="3"/>
+        </w:numPr>
+      </w:pPr>
+      <w:r>
+        <w:t>Is there a criteria for accepting orders that make me better money? More money with less hours dashing?</w:t>
+      </w:r>
+    </w:p>
+    <w:p>
+      <w:pPr>
+        <w:pStyle w:val="ListParagraph"/>
+        <w:numPr>
+          <w:ilvl w:val="1"/>
+          <w:numId w:val="3"/>
+        </w:numPr>
+      </w:pPr>
+      <w:r>
+        <w:t>In SQL:</w:t>
+      </w:r>
+    </w:p>
+    <w:p>
+      <w:pPr>
+        <w:pStyle w:val="ListParagraph"/>
+        <w:numPr>
+          <w:ilvl w:val="2"/>
+          <w:numId w:val="3"/>
+        </w:numPr>
+      </w:pPr>
+      <w:r>
+        <w:t>What’s the most money I made in a day? Week?</w:t>
+      </w:r>
+    </w:p>
+    <w:p>
+      <w:pPr>
+        <w:pStyle w:val="ListParagraph"/>
+        <w:numPr>
+          <w:ilvl w:val="3"/>
+          <w:numId w:val="3"/>
+        </w:numPr>
+      </w:pPr>
+      <w:r>
+        <w:t>What are the compositions of those days? Can I/Should I repeat those type of days; efficient to do so?</w:t>
+      </w:r>
+    </w:p>
+    <w:p>
+      <w:pPr>
+        <w:pStyle w:val="ListParagraph"/>
+        <w:numPr>
+          <w:ilvl w:val="2"/>
+          <w:numId w:val="3"/>
+        </w:numPr>
+      </w:pPr>
+      <w:r>
+        <w:t>What shifts make the most money?</w:t>
+      </w:r>
+    </w:p>
+    <w:p>
+      <w:pPr>
+        <w:pStyle w:val="ListParagraph"/>
+        <w:numPr>
+          <w:ilvl w:val="2"/>
+          <w:numId w:val="3"/>
+        </w:numPr>
+      </w:pPr>
+      <w:r>
+        <w:t>What is my avg, min, max $/mile?</w:t>
+      </w:r>
+    </w:p>
+    <w:p>
+      <w:pPr>
+        <w:pStyle w:val="ListParagraph"/>
+        <w:numPr>
+          <w:ilvl w:val="2"/>
+          <w:numId w:val="3"/>
+        </w:numPr>
+      </w:pPr>
+      <w:r>
+        <w:t>What order paid the highest?</w:t>
+      </w:r>
+    </w:p>
+    <w:p>
+      <w:pPr>
+        <w:pStyle w:val="ListParagraph"/>
+        <w:numPr>
+          <w:ilvl w:val="2"/>
+          <w:numId w:val="3"/>
+        </w:numPr>
+      </w:pPr>
+      <w:r>
+        <w:t>What orders are associated with making the most money overall?</w:t>
+      </w:r>
+    </w:p>
+    <w:p>
+      <w:pPr>
+        <w:pStyle w:val="ListParagraph"/>
+        <w:numPr>
+          <w:ilvl w:val="2"/>
+          <w:numId w:val="3"/>
+        </w:numPr>
+      </w:pPr>
+      <w:r>
+        <w:t>What is my average hours/shift?</w:t>
+      </w:r>
+    </w:p>
+    <w:p>
+      <w:pPr>
+        <w:pStyle w:val="ListParagraph"/>
+        <w:numPr>
+          <w:ilvl w:val="2"/>
+          <w:numId w:val="3"/>
+        </w:numPr>
+      </w:pPr>
+      <w:r>
+        <w:lastRenderedPageBreak/>
+        <w:t>Am I making more or less money with the same hours dashing?</w:t>
+      </w:r>
+    </w:p>
+    <w:p>
+      <w:pPr>
+        <w:pStyle w:val="ListParagraph"/>
+      </w:pPr>
     </w:p>
     <w:p>
       <w:pPr>
@@ -394,15 +455,7 @@
         <w:t>ed</w:t>
       </w:r>
       <w:r>
-        <w:t xml:space="preserve"> synthetic dataset that mirrors my </w:t>
-      </w:r>
-      <w:proofErr w:type="spellStart"/>
-      <w:r>
-        <w:t>Doordash</w:t>
-      </w:r>
-      <w:proofErr w:type="spellEnd"/>
-      <w:r>
-        <w:t xml:space="preserve"> experiences and self-analysis from 11/2025-7/2026.</w:t>
+        <w:t xml:space="preserve"> synthetic dataset that mirrors my Doordash experiences and self-analysis from 11/2025-7/2026.</w:t>
       </w:r>
       <w:r>
         <w:t xml:space="preserve"> </w:t>
@@ -451,6 +504,232 @@
 <file path=word/numbering.xml><?xml version="1.0" encoding="utf-8"?>
 <w:numbering xmlns:wpc="http://schemas.microsoft.com/office/word/2010/wordprocessingCanvas" xmlns:cx="http://schemas.microsoft.com/office/drawing/2014/chartex" xmlns:cx1="http://schemas.microsoft.com/office/drawing/2015/9/8/chartex" xmlns:cx2="http://schemas.microsoft.com/office/drawing/2015/10/21/chartex" xmlns:cx3="http://schemas.microsoft.com/office/drawing/2016/5/9/chartex" xmlns:cx4="http://schemas.microsoft.com/office/drawing/2016/5/10/chartex" xmlns:cx5="http://schemas.microsoft.com/office/drawing/2016/5/11/chartex" xmlns:cx6="http://schemas.microsoft.com/office/drawing/2016/5/12/chartex" xmlns:cx7="http://schemas.microsoft.com/office/drawing/2016/5/13/chartex" xmlns:cx8="http://schemas.microsoft.com/office/drawing/2016/5/14/chartex" xmlns:mc="http://schemas.openxmlformats.org/markup-compatibility/2006" xmlns:aink="http://schemas.microsoft.com/office/drawing/2016/ink" xmlns:am3d="http://schemas.microsoft.com/office/drawing/2017/model3d" xmlns:o="urn:schemas-microsoft-com:office:office" xmlns:oel="http://schemas.microsoft.com/office/2019/extlst" xmlns:r="http://schemas.openxmlformats.org/officeDocument/2006/relationships" xmlns:m="http://schemas.openxmlformats.org/officeDocument/2006/math" xmlns:v="urn:schemas-microsoft-com:vml" xmlns:wp14="http://schemas.microsoft.com/office/word/2010/wordprocessingDrawing" xmlns:wp="http://schemas.openxmlformats.org/drawingml/2006/wordprocessingDrawing" xmlns:w10="urn:schemas-microsoft-com:office:word" xmlns:w="http://schemas.openxmlformats.org/wordprocessingml/2006/main" xmlns:w14="http://schemas.microsoft.com/office/word/2010/wordml" xmlns:w15="http://schemas.microsoft.com/office/word/2012/wordml" xmlns:w16cei="http://schemas.microsoft.com/office/word/2026/wordml/cei" xmlns:w16cex="http://schemas.microsoft.com/office/word/2018/wordml/cex" xmlns:w16cid="http://schemas.microsoft.com/office/word/2016/wordml/cid" xmlns:w16="http://schemas.microsoft.com/office/word/2018/wordml" xmlns:w16du="http://schemas.microsoft.com/office/word/2023/wordml/word16du" xmlns:w16sdtdh="http://schemas.microsoft.com/office/word/2020/wordml/sdtdatahash" xmlns:w16sdtfl="http://schemas.microsoft.com/office/word/2024/wordml/sdtformatlock" xmlns:w16se="http://schemas.microsoft.com/office/word/2015/wordml/symex" xmlns:wpg="http://schemas.microsoft.com/office/word/2010/wordprocessingGroup" xmlns:wpi="http://schemas.microsoft.com/office/word/2010/wordprocessingInk" xmlns:wne="http://schemas.microsoft.com/office/word/2006/wordml" xmlns:wps="http://schemas.microsoft.com/office/word/2010/wordprocessingShape" mc:Ignorable="w14 w15 w16se w16cid w16 w16cex w16sdtdh w16sdtfl w16du wp14">
   <w:abstractNum w:abstractNumId="0" w15:restartNumberingAfterBreak="0">
+    <w:nsid w:val="098F75B1"/>
+    <w:multiLevelType w:val="hybridMultilevel"/>
+    <w:tmpl w:val="D0749BBE"/>
+    <w:lvl w:ilvl="0" w:tplc="04090001">
+      <w:start w:val="1"/>
+      <w:numFmt w:val="bullet"/>
+      <w:lvlText w:val=""/>
+      <w:lvlJc w:val="left"/>
+      <w:pPr>
+        <w:ind w:left="720" w:hanging="360"/>
+      </w:pPr>
+      <w:rPr>
+        <w:rFonts w:ascii="Symbol" w:hAnsi="Symbol" w:hint="default"/>
+      </w:rPr>
+    </w:lvl>
+    <w:lvl w:ilvl="1" w:tplc="04090003" w:tentative="1">
+      <w:start w:val="1"/>
+      <w:numFmt w:val="bullet"/>
+      <w:lvlText w:val="o"/>
+      <w:lvlJc w:val="left"/>
+      <w:pPr>
+        <w:ind w:left="1440" w:hanging="360"/>
+      </w:pPr>
+      <w:rPr>
+        <w:rFonts w:ascii="Courier New" w:hAnsi="Courier New" w:cs="Courier New" w:hint="default"/>
+      </w:rPr>
+    </w:lvl>
+    <w:lvl w:ilvl="2" w:tplc="04090005" w:tentative="1">
+      <w:start w:val="1"/>
+      <w:numFmt w:val="bullet"/>
+      <w:lvlText w:val=""/>
+      <w:lvlJc w:val="left"/>
+      <w:pPr>
+        <w:ind w:left="2160" w:hanging="360"/>
+      </w:pPr>
+      <w:rPr>
+        <w:rFonts w:ascii="Wingdings" w:hAnsi="Wingdings" w:hint="default"/>
+      </w:rPr>
+    </w:lvl>
+    <w:lvl w:ilvl="3" w:tplc="04090001" w:tentative="1">
+      <w:start w:val="1"/>
+      <w:numFmt w:val="bullet"/>
+      <w:lvlText w:val=""/>
+      <w:lvlJc w:val="left"/>
+      <w:pPr>
+        <w:ind w:left="2880" w:hanging="360"/>
+      </w:pPr>
+      <w:rPr>
+        <w:rFonts w:ascii="Symbol" w:hAnsi="Symbol" w:hint="default"/>
+      </w:rPr>
+    </w:lvl>
+    <w:lvl w:ilvl="4" w:tplc="04090003" w:tentative="1">
+      <w:start w:val="1"/>
+      <w:numFmt w:val="bullet"/>
+      <w:lvlText w:val="o"/>
+      <w:lvlJc w:val="left"/>
+      <w:pPr>
+        <w:ind w:left="3600" w:hanging="360"/>
+      </w:pPr>
+      <w:rPr>
+        <w:rFonts w:ascii="Courier New" w:hAnsi="Courier New" w:cs="Courier New" w:hint="default"/>
+      </w:rPr>
+    </w:lvl>
+    <w:lvl w:ilvl="5" w:tplc="04090005" w:tentative="1">
+      <w:start w:val="1"/>
+      <w:numFmt w:val="bullet"/>
+      <w:lvlText w:val=""/>
+      <w:lvlJc w:val="left"/>
+      <w:pPr>
+        <w:ind w:left="4320" w:hanging="360"/>
+      </w:pPr>
+      <w:rPr>
+        <w:rFonts w:ascii="Wingdings" w:hAnsi="Wingdings" w:hint="default"/>
+      </w:rPr>
+    </w:lvl>
+    <w:lvl w:ilvl="6" w:tplc="04090001" w:tentative="1">
+      <w:start w:val="1"/>
+      <w:numFmt w:val="bullet"/>
+      <w:lvlText w:val=""/>
+      <w:lvlJc w:val="left"/>
+      <w:pPr>
+        <w:ind w:left="5040" w:hanging="360"/>
+      </w:pPr>
+      <w:rPr>
+        <w:rFonts w:ascii="Symbol" w:hAnsi="Symbol" w:hint="default"/>
+      </w:rPr>
+    </w:lvl>
+    <w:lvl w:ilvl="7" w:tplc="04090003" w:tentative="1">
+      <w:start w:val="1"/>
+      <w:numFmt w:val="bullet"/>
+      <w:lvlText w:val="o"/>
+      <w:lvlJc w:val="left"/>
+      <w:pPr>
+        <w:ind w:left="5760" w:hanging="360"/>
+      </w:pPr>
+      <w:rPr>
+        <w:rFonts w:ascii="Courier New" w:hAnsi="Courier New" w:cs="Courier New" w:hint="default"/>
+      </w:rPr>
+    </w:lvl>
+    <w:lvl w:ilvl="8" w:tplc="04090005" w:tentative="1">
+      <w:start w:val="1"/>
+      <w:numFmt w:val="bullet"/>
+      <w:lvlText w:val=""/>
+      <w:lvlJc w:val="left"/>
+      <w:pPr>
+        <w:ind w:left="6480" w:hanging="360"/>
+      </w:pPr>
+      <w:rPr>
+        <w:rFonts w:ascii="Wingdings" w:hAnsi="Wingdings" w:hint="default"/>
+      </w:rPr>
+    </w:lvl>
+  </w:abstractNum>
+  <w:abstractNum w:abstractNumId="1" w15:restartNumberingAfterBreak="0">
+    <w:nsid w:val="37D23C18"/>
+    <w:multiLevelType w:val="hybridMultilevel"/>
+    <w:tmpl w:val="4C8883E0"/>
+    <w:lvl w:ilvl="0" w:tplc="04090001">
+      <w:start w:val="1"/>
+      <w:numFmt w:val="bullet"/>
+      <w:lvlText w:val=""/>
+      <w:lvlJc w:val="left"/>
+      <w:pPr>
+        <w:ind w:left="1080" w:hanging="360"/>
+      </w:pPr>
+      <w:rPr>
+        <w:rFonts w:ascii="Symbol" w:hAnsi="Symbol" w:hint="default"/>
+      </w:rPr>
+    </w:lvl>
+    <w:lvl w:ilvl="1" w:tplc="04090003" w:tentative="1">
+      <w:start w:val="1"/>
+      <w:numFmt w:val="bullet"/>
+      <w:lvlText w:val="o"/>
+      <w:lvlJc w:val="left"/>
+      <w:pPr>
+        <w:ind w:left="1800" w:hanging="360"/>
+      </w:pPr>
+      <w:rPr>
+        <w:rFonts w:ascii="Courier New" w:hAnsi="Courier New" w:cs="Courier New" w:hint="default"/>
+      </w:rPr>
+    </w:lvl>
+    <w:lvl w:ilvl="2" w:tplc="04090005" w:tentative="1">
+      <w:start w:val="1"/>
+      <w:numFmt w:val="bullet"/>
+      <w:lvlText w:val=""/>
+      <w:lvlJc w:val="left"/>
+      <w:pPr>
+        <w:ind w:left="2520" w:hanging="360"/>
+      </w:pPr>
+      <w:rPr>
+        <w:rFonts w:ascii="Wingdings" w:hAnsi="Wingdings" w:hint="default"/>
+      </w:rPr>
+    </w:lvl>
+    <w:lvl w:ilvl="3" w:tplc="04090001" w:tentative="1">
+      <w:start w:val="1"/>
+      <w:numFmt w:val="bullet"/>
+      <w:lvlText w:val=""/>
+      <w:lvlJc w:val="left"/>
+      <w:pPr>
+        <w:ind w:left="3240" w:hanging="360"/>
+      </w:pPr>
+      <w:rPr>
+        <w:rFonts w:ascii="Symbol" w:hAnsi="Symbol" w:hint="default"/>
+      </w:rPr>
+    </w:lvl>
+    <w:lvl w:ilvl="4" w:tplc="04090003" w:tentative="1">
+      <w:start w:val="1"/>
+      <w:numFmt w:val="bullet"/>
+      <w:lvlText w:val="o"/>
+      <w:lvlJc w:val="left"/>
+      <w:pPr>
+        <w:ind w:left="3960" w:hanging="360"/>
+      </w:pPr>
+      <w:rPr>
+        <w:rFonts w:ascii="Courier New" w:hAnsi="Courier New" w:cs="Courier New" w:hint="default"/>
+      </w:rPr>
+    </w:lvl>
+    <w:lvl w:ilvl="5" w:tplc="04090005" w:tentative="1">
+      <w:start w:val="1"/>
+      <w:numFmt w:val="bullet"/>
+      <w:lvlText w:val=""/>
+      <w:lvlJc w:val="left"/>
+      <w:pPr>
+        <w:ind w:left="4680" w:hanging="360"/>
+      </w:pPr>
+      <w:rPr>
+        <w:rFonts w:ascii="Wingdings" w:hAnsi="Wingdings" w:hint="default"/>
+      </w:rPr>
+    </w:lvl>
+    <w:lvl w:ilvl="6" w:tplc="04090001" w:tentative="1">
+      <w:start w:val="1"/>
+      <w:numFmt w:val="bullet"/>
+      <w:lvlText w:val=""/>
+      <w:lvlJc w:val="left"/>
+      <w:pPr>
+        <w:ind w:left="5400" w:hanging="360"/>
+      </w:pPr>
+      <w:rPr>
+        <w:rFonts w:ascii="Symbol" w:hAnsi="Symbol" w:hint="default"/>
+      </w:rPr>
+    </w:lvl>
+    <w:lvl w:ilvl="7" w:tplc="04090003" w:tentative="1">
+      <w:start w:val="1"/>
+      <w:numFmt w:val="bullet"/>
+      <w:lvlText w:val="o"/>
+      <w:lvlJc w:val="left"/>
+      <w:pPr>
+        <w:ind w:left="6120" w:hanging="360"/>
+      </w:pPr>
+      <w:rPr>
+        <w:rFonts w:ascii="Courier New" w:hAnsi="Courier New" w:cs="Courier New" w:hint="default"/>
+      </w:rPr>
+    </w:lvl>
+    <w:lvl w:ilvl="8" w:tplc="04090005" w:tentative="1">
+      <w:start w:val="1"/>
+      <w:numFmt w:val="bullet"/>
+      <w:lvlText w:val=""/>
+      <w:lvlJc w:val="left"/>
+      <w:pPr>
+        <w:ind w:left="6840" w:hanging="360"/>
+      </w:pPr>
+      <w:rPr>
+        <w:rFonts w:ascii="Wingdings" w:hAnsi="Wingdings" w:hint="default"/>
+      </w:rPr>
+    </w:lvl>
+  </w:abstractNum>
+  <w:abstractNum w:abstractNumId="2" w15:restartNumberingAfterBreak="0">
     <w:nsid w:val="516F60DE"/>
     <w:multiLevelType w:val="hybridMultilevel"/>
     <w:tmpl w:val="E744E2EA"/>
@@ -563,7 +842,7 @@
       </w:rPr>
     </w:lvl>
   </w:abstractNum>
-  <w:abstractNum w:abstractNumId="1" w15:restartNumberingAfterBreak="0">
+  <w:abstractNum w:abstractNumId="3" w15:restartNumberingAfterBreak="0">
     <w:nsid w:val="6FE279BA"/>
     <w:multiLevelType w:val="hybridMultilevel"/>
     <w:tmpl w:val="5D3A03EC"/>
@@ -676,7 +955,7 @@
       </w:rPr>
     </w:lvl>
   </w:abstractNum>
-  <w:abstractNum w:abstractNumId="2" w15:restartNumberingAfterBreak="0">
+  <w:abstractNum w:abstractNumId="4" w15:restartNumberingAfterBreak="0">
     <w:nsid w:val="724C22D9"/>
     <w:multiLevelType w:val="hybridMultilevel"/>
     <w:tmpl w:val="2A66E762"/>
@@ -790,13 +1069,19 @@
     </w:lvl>
   </w:abstractNum>
   <w:num w:numId="1" w16cid:durableId="512917471">
+    <w:abstractNumId w:val="3"/>
+  </w:num>
+  <w:num w:numId="2" w16cid:durableId="1753311224">
+    <w:abstractNumId w:val="2"/>
+  </w:num>
+  <w:num w:numId="3" w16cid:durableId="1444612632">
+    <w:abstractNumId w:val="4"/>
+  </w:num>
+  <w:num w:numId="4" w16cid:durableId="1543252395">
     <w:abstractNumId w:val="1"/>
   </w:num>
-  <w:num w:numId="2" w16cid:durableId="1753311224">
+  <w:num w:numId="5" w16cid:durableId="52781899">
     <w:abstractNumId w:val="0"/>
-  </w:num>
-  <w:num w:numId="3" w16cid:durableId="1444612632">
-    <w:abstractNumId w:val="2"/>
   </w:num>
 </w:numbering>
 </file>

</xml_diff>

<commit_message>
answered more SQL questions and updated prject notes
</commit_message>
<xml_diff>
--- a/documentation/nicosys-portfolio-operations-dash-documentation.docx
+++ b/documentation/nicosys-portfolio-operations-dash-documentation.docx
@@ -5,6 +5,93 @@
     <w:p>
       <w:r>
         <w:t xml:space="preserve">Doordash Performance </w:t>
+      </w:r>
+    </w:p>
+    <w:p>
+      <w:pPr>
+        <w:rPr>
+          <w:u w:val="single"/>
+        </w:rPr>
+      </w:pPr>
+      <w:r>
+        <w:rPr>
+          <w:u w:val="single"/>
+        </w:rPr>
+        <w:t>7/31/2026</w:t>
+      </w:r>
+    </w:p>
+    <w:p>
+      <w:r>
+        <w:t>To show progress over time, I’ll have 3 charts:</w:t>
+      </w:r>
+    </w:p>
+    <w:p>
+      <w:pPr>
+        <w:pStyle w:val="ListParagraph"/>
+        <w:numPr>
+          <w:ilvl w:val="0"/>
+          <w:numId w:val="6"/>
+        </w:numPr>
+      </w:pPr>
+      <w:r>
+        <w:t>Line graph showing gross earnings over time</w:t>
+      </w:r>
+    </w:p>
+    <w:p>
+      <w:pPr>
+        <w:pStyle w:val="ListParagraph"/>
+        <w:numPr>
+          <w:ilvl w:val="0"/>
+          <w:numId w:val="6"/>
+        </w:numPr>
+      </w:pPr>
+      <w:r>
+        <w:t>Bar graph showing hours worked/day over time</w:t>
+      </w:r>
+    </w:p>
+    <w:p>
+      <w:pPr>
+        <w:pStyle w:val="ListParagraph"/>
+        <w:numPr>
+          <w:ilvl w:val="0"/>
+          <w:numId w:val="6"/>
+        </w:numPr>
+      </w:pPr>
+      <w:r>
+        <w:t>Bar graph showing $/mile acceptance over time</w:t>
+      </w:r>
+    </w:p>
+    <w:p>
+      <w:pPr>
+        <w:pStyle w:val="ListParagraph"/>
+        <w:numPr>
+          <w:ilvl w:val="0"/>
+          <w:numId w:val="6"/>
+        </w:numPr>
+      </w:pPr>
+      <w:r>
+        <w:t xml:space="preserve">Bar graph showing estimated miles driving/shift </w:t>
+      </w:r>
+    </w:p>
+    <w:p>
+      <w:r>
+        <w:t>After implementing my rules, sales should grow, hours worked should decrease, and $/mile should normalize around $2+/mile.</w:t>
+      </w:r>
+    </w:p>
+    <w:p>
+      <w:r>
+        <w:t xml:space="preserve">Additional rules I’ve implemented include accepting orders that are from known efficient restaurants, ETA less than 20 min or between 20-25 min. </w:t>
+      </w:r>
+    </w:p>
+    <w:p/>
+    <w:p>
+      <w:r>
+        <w:t>I think I’ve answered all the questions I need. List them out and analyze them as a whole: is it enough to answer the overall question: How can I make more money with less hours on the road?</w:t>
+      </w:r>
+    </w:p>
+    <w:p>
+      <w:r>
+        <w:t xml:space="preserve"> </w:t>
       </w:r>
     </w:p>
     <w:p>
@@ -148,10 +235,7 @@
         </w:numPr>
       </w:pPr>
       <w:r>
-        <w:t xml:space="preserve">Update LinkedIn with new resume, </w:t>
-      </w:r>
-      <w:r>
-        <w:t>GitHub and Canva links</w:t>
+        <w:t>Update LinkedIn with new resume, GitHub and Canva links</w:t>
       </w:r>
     </w:p>
     <w:p>
@@ -170,6 +254,7 @@
         <w:rPr>
           <w:u w:val="single"/>
         </w:rPr>
+        <w:lastRenderedPageBreak/>
         <w:t>7/29/2026</w:t>
       </w:r>
     </w:p>
@@ -362,7 +447,6 @@
         </w:numPr>
       </w:pPr>
       <w:r>
-        <w:lastRenderedPageBreak/>
         <w:t>Am I making more or less money with the same hours dashing?</w:t>
       </w:r>
     </w:p>
@@ -843,6 +927,119 @@
     </w:lvl>
   </w:abstractNum>
   <w:abstractNum w:abstractNumId="3" w15:restartNumberingAfterBreak="0">
+    <w:nsid w:val="617B0A26"/>
+    <w:multiLevelType w:val="hybridMultilevel"/>
+    <w:tmpl w:val="E5FC9042"/>
+    <w:lvl w:ilvl="0" w:tplc="04090001">
+      <w:start w:val="1"/>
+      <w:numFmt w:val="bullet"/>
+      <w:lvlText w:val=""/>
+      <w:lvlJc w:val="left"/>
+      <w:pPr>
+        <w:ind w:left="720" w:hanging="360"/>
+      </w:pPr>
+      <w:rPr>
+        <w:rFonts w:ascii="Symbol" w:hAnsi="Symbol" w:hint="default"/>
+      </w:rPr>
+    </w:lvl>
+    <w:lvl w:ilvl="1" w:tplc="04090003" w:tentative="1">
+      <w:start w:val="1"/>
+      <w:numFmt w:val="bullet"/>
+      <w:lvlText w:val="o"/>
+      <w:lvlJc w:val="left"/>
+      <w:pPr>
+        <w:ind w:left="1440" w:hanging="360"/>
+      </w:pPr>
+      <w:rPr>
+        <w:rFonts w:ascii="Courier New" w:hAnsi="Courier New" w:cs="Courier New" w:hint="default"/>
+      </w:rPr>
+    </w:lvl>
+    <w:lvl w:ilvl="2" w:tplc="04090005" w:tentative="1">
+      <w:start w:val="1"/>
+      <w:numFmt w:val="bullet"/>
+      <w:lvlText w:val=""/>
+      <w:lvlJc w:val="left"/>
+      <w:pPr>
+        <w:ind w:left="2160" w:hanging="360"/>
+      </w:pPr>
+      <w:rPr>
+        <w:rFonts w:ascii="Wingdings" w:hAnsi="Wingdings" w:hint="default"/>
+      </w:rPr>
+    </w:lvl>
+    <w:lvl w:ilvl="3" w:tplc="04090001" w:tentative="1">
+      <w:start w:val="1"/>
+      <w:numFmt w:val="bullet"/>
+      <w:lvlText w:val=""/>
+      <w:lvlJc w:val="left"/>
+      <w:pPr>
+        <w:ind w:left="2880" w:hanging="360"/>
+      </w:pPr>
+      <w:rPr>
+        <w:rFonts w:ascii="Symbol" w:hAnsi="Symbol" w:hint="default"/>
+      </w:rPr>
+    </w:lvl>
+    <w:lvl w:ilvl="4" w:tplc="04090003" w:tentative="1">
+      <w:start w:val="1"/>
+      <w:numFmt w:val="bullet"/>
+      <w:lvlText w:val="o"/>
+      <w:lvlJc w:val="left"/>
+      <w:pPr>
+        <w:ind w:left="3600" w:hanging="360"/>
+      </w:pPr>
+      <w:rPr>
+        <w:rFonts w:ascii="Courier New" w:hAnsi="Courier New" w:cs="Courier New" w:hint="default"/>
+      </w:rPr>
+    </w:lvl>
+    <w:lvl w:ilvl="5" w:tplc="04090005" w:tentative="1">
+      <w:start w:val="1"/>
+      <w:numFmt w:val="bullet"/>
+      <w:lvlText w:val=""/>
+      <w:lvlJc w:val="left"/>
+      <w:pPr>
+        <w:ind w:left="4320" w:hanging="360"/>
+      </w:pPr>
+      <w:rPr>
+        <w:rFonts w:ascii="Wingdings" w:hAnsi="Wingdings" w:hint="default"/>
+      </w:rPr>
+    </w:lvl>
+    <w:lvl w:ilvl="6" w:tplc="04090001" w:tentative="1">
+      <w:start w:val="1"/>
+      <w:numFmt w:val="bullet"/>
+      <w:lvlText w:val=""/>
+      <w:lvlJc w:val="left"/>
+      <w:pPr>
+        <w:ind w:left="5040" w:hanging="360"/>
+      </w:pPr>
+      <w:rPr>
+        <w:rFonts w:ascii="Symbol" w:hAnsi="Symbol" w:hint="default"/>
+      </w:rPr>
+    </w:lvl>
+    <w:lvl w:ilvl="7" w:tplc="04090003" w:tentative="1">
+      <w:start w:val="1"/>
+      <w:numFmt w:val="bullet"/>
+      <w:lvlText w:val="o"/>
+      <w:lvlJc w:val="left"/>
+      <w:pPr>
+        <w:ind w:left="5760" w:hanging="360"/>
+      </w:pPr>
+      <w:rPr>
+        <w:rFonts w:ascii="Courier New" w:hAnsi="Courier New" w:cs="Courier New" w:hint="default"/>
+      </w:rPr>
+    </w:lvl>
+    <w:lvl w:ilvl="8" w:tplc="04090005" w:tentative="1">
+      <w:start w:val="1"/>
+      <w:numFmt w:val="bullet"/>
+      <w:lvlText w:val=""/>
+      <w:lvlJc w:val="left"/>
+      <w:pPr>
+        <w:ind w:left="6480" w:hanging="360"/>
+      </w:pPr>
+      <w:rPr>
+        <w:rFonts w:ascii="Wingdings" w:hAnsi="Wingdings" w:hint="default"/>
+      </w:rPr>
+    </w:lvl>
+  </w:abstractNum>
+  <w:abstractNum w:abstractNumId="4" w15:restartNumberingAfterBreak="0">
     <w:nsid w:val="6FE279BA"/>
     <w:multiLevelType w:val="hybridMultilevel"/>
     <w:tmpl w:val="5D3A03EC"/>
@@ -955,7 +1152,7 @@
       </w:rPr>
     </w:lvl>
   </w:abstractNum>
-  <w:abstractNum w:abstractNumId="4" w15:restartNumberingAfterBreak="0">
+  <w:abstractNum w:abstractNumId="5" w15:restartNumberingAfterBreak="0">
     <w:nsid w:val="724C22D9"/>
     <w:multiLevelType w:val="hybridMultilevel"/>
     <w:tmpl w:val="2A66E762"/>
@@ -1069,19 +1266,22 @@
     </w:lvl>
   </w:abstractNum>
   <w:num w:numId="1" w16cid:durableId="512917471">
-    <w:abstractNumId w:val="3"/>
+    <w:abstractNumId w:val="4"/>
   </w:num>
   <w:num w:numId="2" w16cid:durableId="1753311224">
     <w:abstractNumId w:val="2"/>
   </w:num>
   <w:num w:numId="3" w16cid:durableId="1444612632">
-    <w:abstractNumId w:val="4"/>
+    <w:abstractNumId w:val="5"/>
   </w:num>
   <w:num w:numId="4" w16cid:durableId="1543252395">
     <w:abstractNumId w:val="1"/>
   </w:num>
   <w:num w:numId="5" w16cid:durableId="52781899">
     <w:abstractNumId w:val="0"/>
+  </w:num>
+  <w:num w:numId="6" w16cid:durableId="774328264">
+    <w:abstractNumId w:val="3"/>
   </w:num>
 </w:numbering>
 </file>

</xml_diff>

<commit_message>
Completed ques in SQL and Excel validations and updated project documentations
</commit_message>
<xml_diff>
--- a/documentation/nicosys-portfolio-operations-dash-documentation.docx
+++ b/documentation/nicosys-portfolio-operations-dash-documentation.docx
@@ -3,8 +3,582 @@
 <w:document xmlns:wpc="http://schemas.microsoft.com/office/word/2010/wordprocessingCanvas" xmlns:cx="http://schemas.microsoft.com/office/drawing/2014/chartex" xmlns:cx1="http://schemas.microsoft.com/office/drawing/2015/9/8/chartex" xmlns:cx2="http://schemas.microsoft.com/office/drawing/2015/10/21/chartex" xmlns:cx3="http://schemas.microsoft.com/office/drawing/2016/5/9/chartex" xmlns:cx4="http://schemas.microsoft.com/office/drawing/2016/5/10/chartex" xmlns:cx5="http://schemas.microsoft.com/office/drawing/2016/5/11/chartex" xmlns:cx6="http://schemas.microsoft.com/office/drawing/2016/5/12/chartex" xmlns:cx7="http://schemas.microsoft.com/office/drawing/2016/5/13/chartex" xmlns:cx8="http://schemas.microsoft.com/office/drawing/2016/5/14/chartex" xmlns:mc="http://schemas.openxmlformats.org/markup-compatibility/2006" xmlns:aink="http://schemas.microsoft.com/office/drawing/2016/ink" xmlns:am3d="http://schemas.microsoft.com/office/drawing/2017/model3d" xmlns:o="urn:schemas-microsoft-com:office:office" xmlns:oel="http://schemas.microsoft.com/office/2019/extlst" xmlns:r="http://schemas.openxmlformats.org/officeDocument/2006/relationships" xmlns:m="http://schemas.openxmlformats.org/officeDocument/2006/math" xmlns:v="urn:schemas-microsoft-com:vml" xmlns:wp14="http://schemas.microsoft.com/office/word/2010/wordprocessingDrawing" xmlns:wp="http://schemas.openxmlformats.org/drawingml/2006/wordprocessingDrawing" xmlns:w10="urn:schemas-microsoft-com:office:word" xmlns:w="http://schemas.openxmlformats.org/wordprocessingml/2006/main" xmlns:w14="http://schemas.microsoft.com/office/word/2010/wordml" xmlns:w15="http://schemas.microsoft.com/office/word/2012/wordml" xmlns:w16cei="http://schemas.microsoft.com/office/word/2026/wordml/cei" xmlns:w16cex="http://schemas.microsoft.com/office/word/2018/wordml/cex" xmlns:w16cid="http://schemas.microsoft.com/office/word/2016/wordml/cid" xmlns:w16="http://schemas.microsoft.com/office/word/2018/wordml" xmlns:w16du="http://schemas.microsoft.com/office/word/2023/wordml/word16du" xmlns:w16sdtdh="http://schemas.microsoft.com/office/word/2020/wordml/sdtdatahash" xmlns:w16sdtfl="http://schemas.microsoft.com/office/word/2024/wordml/sdtformatlock" xmlns:w16se="http://schemas.microsoft.com/office/word/2015/wordml/symex" xmlns:wpg="http://schemas.microsoft.com/office/word/2010/wordprocessingGroup" xmlns:wpi="http://schemas.microsoft.com/office/word/2010/wordprocessingInk" xmlns:wne="http://schemas.microsoft.com/office/word/2006/wordml" xmlns:wps="http://schemas.microsoft.com/office/word/2010/wordprocessingShape" mc:Ignorable="w14 w15 w16se w16cid w16 w16cex w16sdtdh w16sdtfl w16du wp14">
   <w:body>
     <w:p>
-      <w:r>
-        <w:t xml:space="preserve">Doordash Performance </w:t>
+      <w:proofErr w:type="spellStart"/>
+      <w:r>
+        <w:t>Doordash</w:t>
+      </w:r>
+      <w:proofErr w:type="spellEnd"/>
+      <w:r>
+        <w:t xml:space="preserve"> Performance </w:t>
+      </w:r>
+    </w:p>
+    <w:p>
+      <w:pPr>
+        <w:rPr>
+          <w:u w:val="single"/>
+        </w:rPr>
+      </w:pPr>
+      <w:r>
+        <w:rPr>
+          <w:u w:val="single"/>
+        </w:rPr>
+        <w:t>8/1/2026</w:t>
+      </w:r>
+    </w:p>
+    <w:p>
+      <w:r>
+        <w:t>I’ve started validating findings in Excel</w:t>
+      </w:r>
+      <w:r>
+        <w:t xml:space="preserve">. Continue until finished. </w:t>
+      </w:r>
+    </w:p>
+    <w:p>
+      <w:r>
+        <w:t>Business Questions I’ve answer:</w:t>
+      </w:r>
+    </w:p>
+    <w:p>
+      <w:r>
+        <w:t>The</w:t>
+      </w:r>
+      <w:r>
+        <w:t xml:space="preserve"> following questions serve to answer the</w:t>
+      </w:r>
+      <w:r>
+        <w:t xml:space="preserve"> Main Question: How do I make more money with less time dashing?</w:t>
+      </w:r>
+    </w:p>
+    <w:p>
+      <w:pPr>
+        <w:pStyle w:val="ListParagraph"/>
+      </w:pPr>
+    </w:p>
+    <w:p>
+      <w:pPr>
+        <w:pStyle w:val="ListParagraph"/>
+        <w:numPr>
+          <w:ilvl w:val="0"/>
+          <w:numId w:val="7"/>
+        </w:numPr>
+      </w:pPr>
+      <w:r>
+        <w:t>What’s the m</w:t>
+      </w:r>
+      <w:r>
+        <w:t>ost money made on different days of the week</w:t>
+      </w:r>
+      <w:r>
+        <w:t>?</w:t>
+      </w:r>
+      <w:r>
+        <w:t xml:space="preserve"> </w:t>
+      </w:r>
+      <w:r>
+        <w:rPr>
+          <w:b/>
+          <w:bCs/>
+        </w:rPr>
+        <w:t>Validated, Excel</w:t>
+      </w:r>
+    </w:p>
+    <w:p>
+      <w:pPr>
+        <w:pStyle w:val="ListParagraph"/>
+        <w:numPr>
+          <w:ilvl w:val="1"/>
+          <w:numId w:val="7"/>
+        </w:numPr>
+      </w:pPr>
+      <w:r>
+        <w:t>Informs me of the days I should prioritize to maximize earnings.</w:t>
+      </w:r>
+    </w:p>
+    <w:p>
+      <w:pPr>
+        <w:pStyle w:val="ListParagraph"/>
+        <w:numPr>
+          <w:ilvl w:val="2"/>
+          <w:numId w:val="7"/>
+        </w:numPr>
+      </w:pPr>
+      <w:r>
+        <w:t>Sunday, 31 shifts, $2,059.59</w:t>
+      </w:r>
+    </w:p>
+    <w:p>
+      <w:pPr>
+        <w:pStyle w:val="ListParagraph"/>
+        <w:numPr>
+          <w:ilvl w:val="2"/>
+          <w:numId w:val="7"/>
+        </w:numPr>
+      </w:pPr>
+      <w:r>
+        <w:t>Friday, 27 shifts, $1,908.95</w:t>
+      </w:r>
+    </w:p>
+    <w:p>
+      <w:pPr>
+        <w:pStyle w:val="ListParagraph"/>
+        <w:numPr>
+          <w:ilvl w:val="2"/>
+          <w:numId w:val="7"/>
+        </w:numPr>
+      </w:pPr>
+      <w:r>
+        <w:t>Saturday, 25 shifts, $1,579.84</w:t>
+      </w:r>
+    </w:p>
+    <w:p>
+      <w:pPr>
+        <w:pStyle w:val="ListParagraph"/>
+        <w:numPr>
+          <w:ilvl w:val="3"/>
+          <w:numId w:val="7"/>
+        </w:numPr>
+      </w:pPr>
+      <w:r>
+        <w:t>The highest</w:t>
+      </w:r>
+      <w:r>
+        <w:t xml:space="preserve"> </w:t>
+      </w:r>
+      <w:r>
+        <w:t>earning</w:t>
+      </w:r>
+      <w:r>
+        <w:t>s</w:t>
+      </w:r>
+      <w:r>
+        <w:t xml:space="preserve"> come from Friday - Sunday during dinner time.</w:t>
+      </w:r>
+    </w:p>
+    <w:p>
+      <w:pPr>
+        <w:pStyle w:val="ListParagraph"/>
+        <w:numPr>
+          <w:ilvl w:val="3"/>
+          <w:numId w:val="7"/>
+        </w:numPr>
+      </w:pPr>
+      <w:r>
+        <w:t>Friday - Sunday shifts account for 71% or total gross earnings.</w:t>
+      </w:r>
+    </w:p>
+    <w:p>
+      <w:pPr>
+        <w:pStyle w:val="ListParagraph"/>
+        <w:numPr>
+          <w:ilvl w:val="0"/>
+          <w:numId w:val="7"/>
+        </w:numPr>
+      </w:pPr>
+      <w:r>
+        <w:t>Of the busy days, w</w:t>
+      </w:r>
+      <w:r>
+        <w:t>hat shifts are associated with the highest earnings</w:t>
+      </w:r>
+      <w:r>
+        <w:t>?</w:t>
+      </w:r>
+      <w:r>
+        <w:t xml:space="preserve"> </w:t>
+      </w:r>
+      <w:r>
+        <w:rPr>
+          <w:b/>
+          <w:bCs/>
+        </w:rPr>
+        <w:t>Validated, Excel</w:t>
+      </w:r>
+    </w:p>
+    <w:p>
+      <w:pPr>
+        <w:pStyle w:val="ListParagraph"/>
+        <w:numPr>
+          <w:ilvl w:val="1"/>
+          <w:numId w:val="7"/>
+        </w:numPr>
+      </w:pPr>
+      <w:r>
+        <w:t xml:space="preserve">Optimizes my dash schedule to make the most money in a day while reducing burn out and being on the road all day. </w:t>
+      </w:r>
+    </w:p>
+    <w:p>
+      <w:pPr>
+        <w:pStyle w:val="ListParagraph"/>
+        <w:numPr>
+          <w:ilvl w:val="2"/>
+          <w:numId w:val="7"/>
+        </w:numPr>
+      </w:pPr>
+      <w:r>
+        <w:t>Targeted Sprint: $</w:t>
+      </w:r>
+      <w:r>
+        <w:t>80.68</w:t>
+      </w:r>
+      <w:r>
+        <w:t xml:space="preserve">, </w:t>
+      </w:r>
+    </w:p>
+    <w:p>
+      <w:pPr>
+        <w:pStyle w:val="ListParagraph"/>
+        <w:numPr>
+          <w:ilvl w:val="2"/>
+          <w:numId w:val="7"/>
+        </w:numPr>
+      </w:pPr>
+      <w:r>
+        <w:t>Dinner: $</w:t>
+      </w:r>
+      <w:r>
+        <w:t>70</w:t>
+      </w:r>
+      <w:r>
+        <w:t>.</w:t>
+      </w:r>
+      <w:r>
+        <w:t>48</w:t>
+      </w:r>
+      <w:r>
+        <w:t xml:space="preserve">, </w:t>
+      </w:r>
+    </w:p>
+    <w:p>
+      <w:pPr>
+        <w:pStyle w:val="ListParagraph"/>
+        <w:numPr>
+          <w:ilvl w:val="2"/>
+          <w:numId w:val="7"/>
+        </w:numPr>
+      </w:pPr>
+      <w:r>
+        <w:t>Peak Pay: $66.</w:t>
+      </w:r>
+      <w:r>
+        <w:t>09</w:t>
+      </w:r>
+      <w:r>
+        <w:t xml:space="preserve">, </w:t>
+      </w:r>
+    </w:p>
+    <w:p>
+      <w:pPr>
+        <w:pStyle w:val="ListParagraph"/>
+        <w:numPr>
+          <w:ilvl w:val="2"/>
+          <w:numId w:val="7"/>
+        </w:numPr>
+      </w:pPr>
+      <w:r>
+        <w:t xml:space="preserve">Weekend Dinner: $65.73, </w:t>
+      </w:r>
+    </w:p>
+    <w:p>
+      <w:pPr>
+        <w:pStyle w:val="ListParagraph"/>
+        <w:numPr>
+          <w:ilvl w:val="2"/>
+          <w:numId w:val="7"/>
+        </w:numPr>
+      </w:pPr>
+      <w:r>
+        <w:t>Open Schedule: $</w:t>
+      </w:r>
+      <w:r>
+        <w:t>38</w:t>
+      </w:r>
+      <w:r>
+        <w:t>.</w:t>
+      </w:r>
+      <w:r>
+        <w:t>60</w:t>
+      </w:r>
+    </w:p>
+    <w:p>
+      <w:pPr>
+        <w:pStyle w:val="ListParagraph"/>
+        <w:numPr>
+          <w:ilvl w:val="0"/>
+          <w:numId w:val="7"/>
+        </w:numPr>
+      </w:pPr>
+      <w:r>
+        <w:t>Which Zones make</w:t>
+      </w:r>
+      <w:r>
+        <w:t xml:space="preserve"> me</w:t>
+      </w:r>
+      <w:r>
+        <w:t xml:space="preserve"> the most money</w:t>
+      </w:r>
+      <w:r>
+        <w:t>?</w:t>
+      </w:r>
+    </w:p>
+    <w:p>
+      <w:pPr>
+        <w:pStyle w:val="ListParagraph"/>
+        <w:numPr>
+          <w:ilvl w:val="1"/>
+          <w:numId w:val="7"/>
+        </w:numPr>
+      </w:pPr>
+      <w:r>
+        <w:t xml:space="preserve">Gives me insight into which </w:t>
+      </w:r>
+      <w:r>
+        <w:t>areas of Las Vegas</w:t>
+      </w:r>
+      <w:r>
+        <w:t xml:space="preserve"> I should primarily dash in</w:t>
+      </w:r>
+      <w:r>
+        <w:t>.</w:t>
+      </w:r>
+    </w:p>
+    <w:p>
+      <w:pPr>
+        <w:pStyle w:val="ListParagraph"/>
+        <w:numPr>
+          <w:ilvl w:val="2"/>
+          <w:numId w:val="7"/>
+        </w:numPr>
+      </w:pPr>
+      <w:r>
+        <w:t>Henderson: $2,228.78</w:t>
+      </w:r>
+    </w:p>
+    <w:p>
+      <w:pPr>
+        <w:pStyle w:val="ListParagraph"/>
+        <w:numPr>
+          <w:ilvl w:val="2"/>
+          <w:numId w:val="7"/>
+        </w:numPr>
+      </w:pPr>
+      <w:r>
+        <w:t>Green Valley: $1,165.</w:t>
+      </w:r>
+      <w:r>
+        <w:t>62</w:t>
+      </w:r>
+    </w:p>
+    <w:p>
+      <w:pPr>
+        <w:pStyle w:val="ListParagraph"/>
+        <w:numPr>
+          <w:ilvl w:val="0"/>
+          <w:numId w:val="7"/>
+        </w:numPr>
+      </w:pPr>
+      <w:r>
+        <w:t>What is my average, minimum, and max $/mile?</w:t>
+      </w:r>
+    </w:p>
+    <w:p>
+      <w:pPr>
+        <w:pStyle w:val="ListParagraph"/>
+        <w:numPr>
+          <w:ilvl w:val="1"/>
+          <w:numId w:val="7"/>
+        </w:numPr>
+      </w:pPr>
+      <w:r>
+        <w:t>Shows me improved adherence to rule and how it could affect overall earnings over time.</w:t>
+      </w:r>
+    </w:p>
+    <w:p>
+      <w:pPr>
+        <w:pStyle w:val="ListParagraph"/>
+        <w:numPr>
+          <w:ilvl w:val="2"/>
+          <w:numId w:val="7"/>
+        </w:numPr>
+      </w:pPr>
+      <w:r>
+        <w:t>Avg $/mile = $3.45</w:t>
+      </w:r>
+    </w:p>
+    <w:p>
+      <w:pPr>
+        <w:pStyle w:val="ListParagraph"/>
+        <w:numPr>
+          <w:ilvl w:val="2"/>
+          <w:numId w:val="7"/>
+        </w:numPr>
+      </w:pPr>
+      <w:r>
+        <w:t>Min $/mile = $.60</w:t>
+      </w:r>
+    </w:p>
+    <w:p>
+      <w:pPr>
+        <w:pStyle w:val="ListParagraph"/>
+        <w:numPr>
+          <w:ilvl w:val="2"/>
+          <w:numId w:val="7"/>
+        </w:numPr>
+      </w:pPr>
+      <w:r>
+        <w:t>Max $/mile = $8.55</w:t>
+      </w:r>
+    </w:p>
+    <w:p>
+      <w:pPr>
+        <w:pStyle w:val="ListParagraph"/>
+        <w:numPr>
+          <w:ilvl w:val="0"/>
+          <w:numId w:val="7"/>
+        </w:numPr>
+      </w:pPr>
+      <w:r>
+        <w:t>What is the trend of my hours per shift over time?</w:t>
+      </w:r>
+    </w:p>
+    <w:p/>
+    <w:p>
+      <w:r>
+        <w:t>Rules I’ve adopted to help me make more money in less time:</w:t>
+      </w:r>
+    </w:p>
+    <w:p>
+      <w:pPr>
+        <w:pStyle w:val="ListParagraph"/>
+        <w:numPr>
+          <w:ilvl w:val="0"/>
+          <w:numId w:val="8"/>
+        </w:numPr>
+      </w:pPr>
+      <w:r>
+        <w:t>$2+/mile per order</w:t>
+      </w:r>
+    </w:p>
+    <w:p>
+      <w:pPr>
+        <w:pStyle w:val="ListParagraph"/>
+        <w:numPr>
+          <w:ilvl w:val="1"/>
+          <w:numId w:val="8"/>
+        </w:numPr>
+      </w:pPr>
+      <w:r>
+        <w:t xml:space="preserve">I’ve </w:t>
+      </w:r>
+      <w:r>
+        <w:t>researched</w:t>
+      </w:r>
+      <w:r>
+        <w:t xml:space="preserve"> that the IRS and AAA insurance defines ‘wear and tear’ as .50-.70/mile. </w:t>
+      </w:r>
+      <w:r>
+        <w:t>Therefore,</w:t>
+      </w:r>
+      <w:r>
+        <w:t xml:space="preserve"> to deal with wear and tear, and still make money, I chose $2/mile, leaving me with earnings at $1.30-$1.50/mile. </w:t>
+      </w:r>
+    </w:p>
+    <w:p>
+      <w:pPr>
+        <w:pStyle w:val="ListParagraph"/>
+        <w:numPr>
+          <w:ilvl w:val="0"/>
+          <w:numId w:val="8"/>
+        </w:numPr>
+      </w:pPr>
+      <w:r>
+        <w:t xml:space="preserve">$7+/order </w:t>
+      </w:r>
+    </w:p>
+    <w:p>
+      <w:pPr>
+        <w:pStyle w:val="ListParagraph"/>
+        <w:numPr>
+          <w:ilvl w:val="1"/>
+          <w:numId w:val="8"/>
+        </w:numPr>
+      </w:pPr>
+      <w:r>
+        <w:t>Anything less than an overall order of $7, unless the $/mile is good, usually</w:t>
+      </w:r>
+      <w:r>
+        <w:t xml:space="preserve"> has me putting more wear and tear on my car and out in the streets dashing longer than needed. $7+/order increases my chances to make more money with less wear and tear on my car and less hours dashing. </w:t>
+      </w:r>
+    </w:p>
+    <w:p>
+      <w:pPr>
+        <w:pStyle w:val="ListParagraph"/>
+        <w:numPr>
+          <w:ilvl w:val="0"/>
+          <w:numId w:val="8"/>
+        </w:numPr>
+      </w:pPr>
+      <w:r>
+        <w:t>Order ETAs of &lt;20 min or 20-25 min</w:t>
+      </w:r>
+    </w:p>
+    <w:p>
+      <w:pPr>
+        <w:pStyle w:val="ListParagraph"/>
+        <w:numPr>
+          <w:ilvl w:val="1"/>
+          <w:numId w:val="8"/>
+        </w:numPr>
+      </w:pPr>
+      <w:r>
+        <w:t xml:space="preserve">Taking too long on 1 order could potentially prevent me from taking 2-3 orders in that same amount of time. </w:t>
+      </w:r>
+    </w:p>
+    <w:p>
+      <w:pPr>
+        <w:pStyle w:val="ListParagraph"/>
+        <w:numPr>
+          <w:ilvl w:val="0"/>
+          <w:numId w:val="8"/>
+        </w:numPr>
+      </w:pPr>
+      <w:r>
+        <w:t>Being selective of businesses</w:t>
+      </w:r>
+    </w:p>
+    <w:p>
+      <w:pPr>
+        <w:pStyle w:val="ListParagraph"/>
+        <w:numPr>
+          <w:ilvl w:val="1"/>
+          <w:numId w:val="8"/>
+        </w:numPr>
+      </w:pPr>
+      <w:r>
+        <w:t xml:space="preserve">Certain </w:t>
+      </w:r>
+      <w:r>
+        <w:t>restaurants</w:t>
+      </w:r>
+      <w:r>
+        <w:t xml:space="preserve"> may take too long to prepare orders, or certain orders require more labor and time to complete. I keep notes on a business</w:t>
+      </w:r>
+      <w:r>
+        <w:t xml:space="preserve">’s </w:t>
+      </w:r>
+      <w:r>
+        <w:t xml:space="preserve">operations and service. </w:t>
+      </w:r>
+    </w:p>
+    <w:p>
+      <w:pPr>
+        <w:pStyle w:val="ListParagraph"/>
+        <w:numPr>
+          <w:ilvl w:val="0"/>
+          <w:numId w:val="8"/>
+        </w:numPr>
+      </w:pPr>
+      <w:r>
+        <w:t xml:space="preserve">Staying away from the Strip due to overall traffic and difficulty in getting to business establishments. </w:t>
       </w:r>
     </w:p>
     <w:p>
@@ -86,6 +660,7 @@
     <w:p/>
     <w:p>
       <w:r>
+        <w:lastRenderedPageBreak/>
         <w:t>I think I’ve answered all the questions I need. List them out and analyze them as a whole: is it enough to answer the overall question: How can I make more money with less hours on the road?</w:t>
       </w:r>
     </w:p>
@@ -199,7 +774,15 @@
         </w:numPr>
       </w:pPr>
       <w:r>
-        <w:t>Have PDFs of each of the three PowerBi projects/files</w:t>
+        <w:t xml:space="preserve">Have PDFs of each of the three </w:t>
+      </w:r>
+      <w:proofErr w:type="spellStart"/>
+      <w:r>
+        <w:t>PowerBi</w:t>
+      </w:r>
+      <w:proofErr w:type="spellEnd"/>
+      <w:r>
+        <w:t xml:space="preserve"> projects/files</w:t>
       </w:r>
     </w:p>
     <w:p>
@@ -211,7 +794,23 @@
         </w:numPr>
       </w:pPr>
       <w:r>
-        <w:t xml:space="preserve">Create canva and powerpoint presentations on each project </w:t>
+        <w:t xml:space="preserve">Create </w:t>
+      </w:r>
+      <w:proofErr w:type="spellStart"/>
+      <w:r>
+        <w:t>canva</w:t>
+      </w:r>
+      <w:proofErr w:type="spellEnd"/>
+      <w:r>
+        <w:t xml:space="preserve"> and </w:t>
+      </w:r>
+      <w:proofErr w:type="spellStart"/>
+      <w:r>
+        <w:t>powerpoint</w:t>
+      </w:r>
+      <w:proofErr w:type="spellEnd"/>
+      <w:r>
+        <w:t xml:space="preserve"> presentations on each project </w:t>
       </w:r>
     </w:p>
     <w:p>
@@ -254,7 +853,6 @@
         <w:rPr>
           <w:u w:val="single"/>
         </w:rPr>
-        <w:lastRenderedPageBreak/>
         <w:t>7/29/2026</w:t>
       </w:r>
     </w:p>
@@ -399,6 +997,7 @@
         </w:numPr>
       </w:pPr>
       <w:r>
+        <w:lastRenderedPageBreak/>
         <w:t>What is my avg, min, max $/mile?</w:t>
       </w:r>
     </w:p>
@@ -539,7 +1138,15 @@
         <w:t>ed</w:t>
       </w:r>
       <w:r>
-        <w:t xml:space="preserve"> synthetic dataset that mirrors my Doordash experiences and self-analysis from 11/2025-7/2026.</w:t>
+        <w:t xml:space="preserve"> synthetic dataset that mirrors my </w:t>
+      </w:r>
+      <w:proofErr w:type="spellStart"/>
+      <w:r>
+        <w:t>Doordash</w:t>
+      </w:r>
+      <w:proofErr w:type="spellEnd"/>
+      <w:r>
+        <w:t xml:space="preserve"> experiences and self-analysis from 11/2025-7/2026.</w:t>
       </w:r>
       <w:r>
         <w:t xml:space="preserve"> </w:t>
@@ -701,6 +1308,119 @@
     </w:lvl>
   </w:abstractNum>
   <w:abstractNum w:abstractNumId="1" w15:restartNumberingAfterBreak="0">
+    <w:nsid w:val="1E671E4E"/>
+    <w:multiLevelType w:val="hybridMultilevel"/>
+    <w:tmpl w:val="8D7C6FB6"/>
+    <w:lvl w:ilvl="0" w:tplc="04090001">
+      <w:start w:val="1"/>
+      <w:numFmt w:val="bullet"/>
+      <w:lvlText w:val=""/>
+      <w:lvlJc w:val="left"/>
+      <w:pPr>
+        <w:ind w:left="720" w:hanging="360"/>
+      </w:pPr>
+      <w:rPr>
+        <w:rFonts w:ascii="Symbol" w:hAnsi="Symbol" w:hint="default"/>
+      </w:rPr>
+    </w:lvl>
+    <w:lvl w:ilvl="1" w:tplc="04090003">
+      <w:start w:val="1"/>
+      <w:numFmt w:val="bullet"/>
+      <w:lvlText w:val="o"/>
+      <w:lvlJc w:val="left"/>
+      <w:pPr>
+        <w:ind w:left="1440" w:hanging="360"/>
+      </w:pPr>
+      <w:rPr>
+        <w:rFonts w:ascii="Courier New" w:hAnsi="Courier New" w:cs="Courier New" w:hint="default"/>
+      </w:rPr>
+    </w:lvl>
+    <w:lvl w:ilvl="2" w:tplc="04090005" w:tentative="1">
+      <w:start w:val="1"/>
+      <w:numFmt w:val="bullet"/>
+      <w:lvlText w:val=""/>
+      <w:lvlJc w:val="left"/>
+      <w:pPr>
+        <w:ind w:left="2160" w:hanging="360"/>
+      </w:pPr>
+      <w:rPr>
+        <w:rFonts w:ascii="Wingdings" w:hAnsi="Wingdings" w:hint="default"/>
+      </w:rPr>
+    </w:lvl>
+    <w:lvl w:ilvl="3" w:tplc="04090001" w:tentative="1">
+      <w:start w:val="1"/>
+      <w:numFmt w:val="bullet"/>
+      <w:lvlText w:val=""/>
+      <w:lvlJc w:val="left"/>
+      <w:pPr>
+        <w:ind w:left="2880" w:hanging="360"/>
+      </w:pPr>
+      <w:rPr>
+        <w:rFonts w:ascii="Symbol" w:hAnsi="Symbol" w:hint="default"/>
+      </w:rPr>
+    </w:lvl>
+    <w:lvl w:ilvl="4" w:tplc="04090003" w:tentative="1">
+      <w:start w:val="1"/>
+      <w:numFmt w:val="bullet"/>
+      <w:lvlText w:val="o"/>
+      <w:lvlJc w:val="left"/>
+      <w:pPr>
+        <w:ind w:left="3600" w:hanging="360"/>
+      </w:pPr>
+      <w:rPr>
+        <w:rFonts w:ascii="Courier New" w:hAnsi="Courier New" w:cs="Courier New" w:hint="default"/>
+      </w:rPr>
+    </w:lvl>
+    <w:lvl w:ilvl="5" w:tplc="04090005" w:tentative="1">
+      <w:start w:val="1"/>
+      <w:numFmt w:val="bullet"/>
+      <w:lvlText w:val=""/>
+      <w:lvlJc w:val="left"/>
+      <w:pPr>
+        <w:ind w:left="4320" w:hanging="360"/>
+      </w:pPr>
+      <w:rPr>
+        <w:rFonts w:ascii="Wingdings" w:hAnsi="Wingdings" w:hint="default"/>
+      </w:rPr>
+    </w:lvl>
+    <w:lvl w:ilvl="6" w:tplc="04090001" w:tentative="1">
+      <w:start w:val="1"/>
+      <w:numFmt w:val="bullet"/>
+      <w:lvlText w:val=""/>
+      <w:lvlJc w:val="left"/>
+      <w:pPr>
+        <w:ind w:left="5040" w:hanging="360"/>
+      </w:pPr>
+      <w:rPr>
+        <w:rFonts w:ascii="Symbol" w:hAnsi="Symbol" w:hint="default"/>
+      </w:rPr>
+    </w:lvl>
+    <w:lvl w:ilvl="7" w:tplc="04090003" w:tentative="1">
+      <w:start w:val="1"/>
+      <w:numFmt w:val="bullet"/>
+      <w:lvlText w:val="o"/>
+      <w:lvlJc w:val="left"/>
+      <w:pPr>
+        <w:ind w:left="5760" w:hanging="360"/>
+      </w:pPr>
+      <w:rPr>
+        <w:rFonts w:ascii="Courier New" w:hAnsi="Courier New" w:cs="Courier New" w:hint="default"/>
+      </w:rPr>
+    </w:lvl>
+    <w:lvl w:ilvl="8" w:tplc="04090005" w:tentative="1">
+      <w:start w:val="1"/>
+      <w:numFmt w:val="bullet"/>
+      <w:lvlText w:val=""/>
+      <w:lvlJc w:val="left"/>
+      <w:pPr>
+        <w:ind w:left="6480" w:hanging="360"/>
+      </w:pPr>
+      <w:rPr>
+        <w:rFonts w:ascii="Wingdings" w:hAnsi="Wingdings" w:hint="default"/>
+      </w:rPr>
+    </w:lvl>
+  </w:abstractNum>
+  <w:abstractNum w:abstractNumId="2" w15:restartNumberingAfterBreak="0">
     <w:nsid w:val="37D23C18"/>
     <w:multiLevelType w:val="hybridMultilevel"/>
     <w:tmpl w:val="4C8883E0"/>
@@ -813,7 +1533,7 @@
       </w:rPr>
     </w:lvl>
   </w:abstractNum>
-  <w:abstractNum w:abstractNumId="2" w15:restartNumberingAfterBreak="0">
+  <w:abstractNum w:abstractNumId="3" w15:restartNumberingAfterBreak="0">
     <w:nsid w:val="516F60DE"/>
     <w:multiLevelType w:val="hybridMultilevel"/>
     <w:tmpl w:val="E744E2EA"/>
@@ -926,7 +1646,7 @@
       </w:rPr>
     </w:lvl>
   </w:abstractNum>
-  <w:abstractNum w:abstractNumId="3" w15:restartNumberingAfterBreak="0">
+  <w:abstractNum w:abstractNumId="4" w15:restartNumberingAfterBreak="0">
     <w:nsid w:val="617B0A26"/>
     <w:multiLevelType w:val="hybridMultilevel"/>
     <w:tmpl w:val="E5FC9042"/>
@@ -1039,7 +1759,7 @@
       </w:rPr>
     </w:lvl>
   </w:abstractNum>
-  <w:abstractNum w:abstractNumId="4" w15:restartNumberingAfterBreak="0">
+  <w:abstractNum w:abstractNumId="5" w15:restartNumberingAfterBreak="0">
     <w:nsid w:val="6FE279BA"/>
     <w:multiLevelType w:val="hybridMultilevel"/>
     <w:tmpl w:val="5D3A03EC"/>
@@ -1152,7 +1872,7 @@
       </w:rPr>
     </w:lvl>
   </w:abstractNum>
-  <w:abstractNum w:abstractNumId="5" w15:restartNumberingAfterBreak="0">
+  <w:abstractNum w:abstractNumId="6" w15:restartNumberingAfterBreak="0">
     <w:nsid w:val="724C22D9"/>
     <w:multiLevelType w:val="hybridMultilevel"/>
     <w:tmpl w:val="2A66E762"/>
@@ -1265,23 +1985,142 @@
       </w:rPr>
     </w:lvl>
   </w:abstractNum>
+  <w:abstractNum w:abstractNumId="7" w15:restartNumberingAfterBreak="0">
+    <w:nsid w:val="738213FA"/>
+    <w:multiLevelType w:val="hybridMultilevel"/>
+    <w:tmpl w:val="8996C4B4"/>
+    <w:lvl w:ilvl="0" w:tplc="0409000D">
+      <w:start w:val="1"/>
+      <w:numFmt w:val="bullet"/>
+      <w:lvlText w:val=""/>
+      <w:lvlJc w:val="left"/>
+      <w:pPr>
+        <w:ind w:left="720" w:hanging="360"/>
+      </w:pPr>
+      <w:rPr>
+        <w:rFonts w:ascii="Wingdings" w:hAnsi="Wingdings" w:hint="default"/>
+      </w:rPr>
+    </w:lvl>
+    <w:lvl w:ilvl="1" w:tplc="04090003">
+      <w:start w:val="1"/>
+      <w:numFmt w:val="bullet"/>
+      <w:lvlText w:val="o"/>
+      <w:lvlJc w:val="left"/>
+      <w:pPr>
+        <w:ind w:left="1440" w:hanging="360"/>
+      </w:pPr>
+      <w:rPr>
+        <w:rFonts w:ascii="Courier New" w:hAnsi="Courier New" w:cs="Courier New" w:hint="default"/>
+      </w:rPr>
+    </w:lvl>
+    <w:lvl w:ilvl="2" w:tplc="04090005">
+      <w:start w:val="1"/>
+      <w:numFmt w:val="bullet"/>
+      <w:lvlText w:val=""/>
+      <w:lvlJc w:val="left"/>
+      <w:pPr>
+        <w:ind w:left="2160" w:hanging="360"/>
+      </w:pPr>
+      <w:rPr>
+        <w:rFonts w:ascii="Wingdings" w:hAnsi="Wingdings" w:hint="default"/>
+      </w:rPr>
+    </w:lvl>
+    <w:lvl w:ilvl="3" w:tplc="04090001">
+      <w:start w:val="1"/>
+      <w:numFmt w:val="bullet"/>
+      <w:lvlText w:val=""/>
+      <w:lvlJc w:val="left"/>
+      <w:pPr>
+        <w:ind w:left="2880" w:hanging="360"/>
+      </w:pPr>
+      <w:rPr>
+        <w:rFonts w:ascii="Symbol" w:hAnsi="Symbol" w:hint="default"/>
+      </w:rPr>
+    </w:lvl>
+    <w:lvl w:ilvl="4" w:tplc="04090003" w:tentative="1">
+      <w:start w:val="1"/>
+      <w:numFmt w:val="bullet"/>
+      <w:lvlText w:val="o"/>
+      <w:lvlJc w:val="left"/>
+      <w:pPr>
+        <w:ind w:left="3600" w:hanging="360"/>
+      </w:pPr>
+      <w:rPr>
+        <w:rFonts w:ascii="Courier New" w:hAnsi="Courier New" w:cs="Courier New" w:hint="default"/>
+      </w:rPr>
+    </w:lvl>
+    <w:lvl w:ilvl="5" w:tplc="04090005" w:tentative="1">
+      <w:start w:val="1"/>
+      <w:numFmt w:val="bullet"/>
+      <w:lvlText w:val=""/>
+      <w:lvlJc w:val="left"/>
+      <w:pPr>
+        <w:ind w:left="4320" w:hanging="360"/>
+      </w:pPr>
+      <w:rPr>
+        <w:rFonts w:ascii="Wingdings" w:hAnsi="Wingdings" w:hint="default"/>
+      </w:rPr>
+    </w:lvl>
+    <w:lvl w:ilvl="6" w:tplc="04090001" w:tentative="1">
+      <w:start w:val="1"/>
+      <w:numFmt w:val="bullet"/>
+      <w:lvlText w:val=""/>
+      <w:lvlJc w:val="left"/>
+      <w:pPr>
+        <w:ind w:left="5040" w:hanging="360"/>
+      </w:pPr>
+      <w:rPr>
+        <w:rFonts w:ascii="Symbol" w:hAnsi="Symbol" w:hint="default"/>
+      </w:rPr>
+    </w:lvl>
+    <w:lvl w:ilvl="7" w:tplc="04090003" w:tentative="1">
+      <w:start w:val="1"/>
+      <w:numFmt w:val="bullet"/>
+      <w:lvlText w:val="o"/>
+      <w:lvlJc w:val="left"/>
+      <w:pPr>
+        <w:ind w:left="5760" w:hanging="360"/>
+      </w:pPr>
+      <w:rPr>
+        <w:rFonts w:ascii="Courier New" w:hAnsi="Courier New" w:cs="Courier New" w:hint="default"/>
+      </w:rPr>
+    </w:lvl>
+    <w:lvl w:ilvl="8" w:tplc="04090005" w:tentative="1">
+      <w:start w:val="1"/>
+      <w:numFmt w:val="bullet"/>
+      <w:lvlText w:val=""/>
+      <w:lvlJc w:val="left"/>
+      <w:pPr>
+        <w:ind w:left="6480" w:hanging="360"/>
+      </w:pPr>
+      <w:rPr>
+        <w:rFonts w:ascii="Wingdings" w:hAnsi="Wingdings" w:hint="default"/>
+      </w:rPr>
+    </w:lvl>
+  </w:abstractNum>
   <w:num w:numId="1" w16cid:durableId="512917471">
-    <w:abstractNumId w:val="4"/>
+    <w:abstractNumId w:val="5"/>
   </w:num>
   <w:num w:numId="2" w16cid:durableId="1753311224">
-    <w:abstractNumId w:val="2"/>
+    <w:abstractNumId w:val="3"/>
   </w:num>
   <w:num w:numId="3" w16cid:durableId="1444612632">
-    <w:abstractNumId w:val="5"/>
+    <w:abstractNumId w:val="6"/>
   </w:num>
   <w:num w:numId="4" w16cid:durableId="1543252395">
-    <w:abstractNumId w:val="1"/>
+    <w:abstractNumId w:val="2"/>
   </w:num>
   <w:num w:numId="5" w16cid:durableId="52781899">
     <w:abstractNumId w:val="0"/>
   </w:num>
   <w:num w:numId="6" w16cid:durableId="774328264">
-    <w:abstractNumId w:val="3"/>
+    <w:abstractNumId w:val="4"/>
+  </w:num>
+  <w:num w:numId="7" w16cid:durableId="902790525">
+    <w:abstractNumId w:val="7"/>
+  </w:num>
+  <w:num w:numId="8" w16cid:durableId="1181427494">
+    <w:abstractNumId w:val="1"/>
   </w:num>
 </w:numbering>
 </file>
@@ -1889,7 +2728,6 @@
   <w:style w:type="character" w:default="1" w:styleId="DefaultParagraphFont">
     <w:name w:val="Default Paragraph Font"/>
     <w:uiPriority w:val="1"/>
-    <w:semiHidden/>
     <w:unhideWhenUsed/>
   </w:style>
   <w:style w:type="table" w:default="1" w:styleId="TableNormal">

</xml_diff>

<commit_message>
Completed Excel validation, created BI file, and updated project documentation
</commit_message>
<xml_diff>
--- a/documentation/nicosys-portfolio-operations-dash-documentation.docx
+++ b/documentation/nicosys-portfolio-operations-dash-documentation.docx
@@ -10,6 +10,37 @@
       <w:proofErr w:type="spellEnd"/>
       <w:r>
         <w:t xml:space="preserve"> Performance </w:t>
+      </w:r>
+    </w:p>
+    <w:p>
+      <w:pPr>
+        <w:rPr>
+          <w:u w:val="single"/>
+        </w:rPr>
+      </w:pPr>
+      <w:r>
+        <w:rPr>
+          <w:u w:val="single"/>
+        </w:rPr>
+        <w:t>8/2/2026</w:t>
+      </w:r>
+    </w:p>
+    <w:p>
+      <w:r>
+        <w:t xml:space="preserve">While I was working on my project, a guy named Jay, also a </w:t>
+      </w:r>
+      <w:proofErr w:type="spellStart"/>
+      <w:r>
+        <w:t>doordash</w:t>
+      </w:r>
+      <w:proofErr w:type="spellEnd"/>
+      <w:r>
+        <w:t xml:space="preserve">/uber eats hustler, picked my brain about my dashboard. We talked about my project for a bit and I explained how my strategy allowed me to make more money with less time on the road. </w:t>
+      </w:r>
+    </w:p>
+    <w:p>
+      <w:r>
+        <w:t xml:space="preserve">I’m almost done with dashboard. </w:t>
       </w:r>
     </w:p>
     <w:p>
@@ -319,6 +350,16 @@
       <w:r>
         <w:t>?</w:t>
       </w:r>
+      <w:r>
+        <w:t xml:space="preserve"> </w:t>
+      </w:r>
+      <w:r>
+        <w:rPr>
+          <w:b/>
+          <w:bCs/>
+        </w:rPr>
+        <w:t>Validated in Excel</w:t>
+      </w:r>
     </w:p>
     <w:p>
       <w:pPr>
@@ -379,6 +420,16 @@
       <w:r>
         <w:t>What is my average, minimum, and max $/mile?</w:t>
       </w:r>
+      <w:r>
+        <w:t xml:space="preserve"> </w:t>
+      </w:r>
+      <w:r>
+        <w:rPr>
+          <w:b/>
+          <w:bCs/>
+        </w:rPr>
+        <w:t>Validated in Excel</w:t>
+      </w:r>
     </w:p>
     <w:p>
       <w:pPr>
@@ -389,6 +440,7 @@
         </w:numPr>
       </w:pPr>
       <w:r>
+        <w:lastRenderedPageBreak/>
         <w:t>Shows me improved adherence to rule and how it could affect overall earnings over time.</w:t>
       </w:r>
     </w:p>
@@ -438,6 +490,66 @@
       </w:pPr>
       <w:r>
         <w:t>What is the trend of my hours per shift over time?</w:t>
+      </w:r>
+    </w:p>
+    <w:p>
+      <w:pPr>
+        <w:pStyle w:val="ListParagraph"/>
+        <w:numPr>
+          <w:ilvl w:val="1"/>
+          <w:numId w:val="7"/>
+        </w:numPr>
+      </w:pPr>
+      <w:r>
+        <w:t>At the start</w:t>
+      </w:r>
+      <w:r>
+        <w:t xml:space="preserve"> of dashing (11/3/2025 – 1/11/2026)</w:t>
+      </w:r>
+      <w:r>
+        <w:t>, I work</w:t>
+      </w:r>
+      <w:r>
+        <w:t>ed</w:t>
+      </w:r>
+      <w:r>
+        <w:t xml:space="preserve"> an average of 6 hours per shift. Overtime, I start</w:t>
+      </w:r>
+      <w:r>
+        <w:t>ed</w:t>
+      </w:r>
+      <w:r>
+        <w:t xml:space="preserve"> averag</w:t>
+      </w:r>
+      <w:r>
+        <w:t>ing</w:t>
+      </w:r>
+      <w:r>
+        <w:t xml:space="preserve"> 4 hours/shift and ma</w:t>
+      </w:r>
+      <w:r>
+        <w:t>d</w:t>
+      </w:r>
+      <w:r>
+        <w:t>e more money if not the same as working 6+ hours/shift. For example, I would work several 4 hours shifts and make $70+</w:t>
+      </w:r>
+      <w:r>
+        <w:t>/day</w:t>
+      </w:r>
+      <w:r>
+        <w:t xml:space="preserve"> compared to working 6-7 hours and barely making $70 for the day.  </w:t>
+      </w:r>
+    </w:p>
+    <w:p>
+      <w:pPr>
+        <w:pStyle w:val="ListParagraph"/>
+        <w:numPr>
+          <w:ilvl w:val="1"/>
+          <w:numId w:val="7"/>
+        </w:numPr>
+      </w:pPr>
+      <w:r>
+        <w:t xml:space="preserve">The trend I observed was that as time went on, I worked less hours and made more money. </w:t>
       </w:r>
     </w:p>
     <w:p/>
@@ -608,6 +720,7 @@
         </w:numPr>
       </w:pPr>
       <w:r>
+        <w:lastRenderedPageBreak/>
         <w:t>Line graph showing gross earnings over time</w:t>
       </w:r>
     </w:p>
@@ -660,7 +773,6 @@
     <w:p/>
     <w:p>
       <w:r>
-        <w:lastRenderedPageBreak/>
         <w:t>I think I’ve answered all the questions I need. List them out and analyze them as a whole: is it enough to answer the overall question: How can I make more money with less hours on the road?</w:t>
       </w:r>
     </w:p>
@@ -889,6 +1001,7 @@
         </w:numPr>
       </w:pPr>
       <w:r>
+        <w:lastRenderedPageBreak/>
         <w:t>What hours of the day do I make more money?</w:t>
       </w:r>
     </w:p>
@@ -997,7 +1110,6 @@
         </w:numPr>
       </w:pPr>
       <w:r>
-        <w:lastRenderedPageBreak/>
         <w:t>What is my avg, min, max $/mile?</w:t>
       </w:r>
     </w:p>
@@ -2728,6 +2840,7 @@
   <w:style w:type="character" w:default="1" w:styleId="DefaultParagraphFont">
     <w:name w:val="Default Paragraph Font"/>
     <w:uiPriority w:val="1"/>
+    <w:semiHidden/>
     <w:unhideWhenUsed/>
   </w:style>
   <w:style w:type="table" w:default="1" w:styleId="TableNormal">

</xml_diff>

<commit_message>
Completed dashboard, created PDF report, and updated project documentation
</commit_message>
<xml_diff>
--- a/documentation/nicosys-portfolio-operations-dash-documentation.docx
+++ b/documentation/nicosys-portfolio-operations-dash-documentation.docx
@@ -3,13 +3,8 @@
 <w:document xmlns:wpc="http://schemas.microsoft.com/office/word/2010/wordprocessingCanvas" xmlns:cx="http://schemas.microsoft.com/office/drawing/2014/chartex" xmlns:cx1="http://schemas.microsoft.com/office/drawing/2015/9/8/chartex" xmlns:cx2="http://schemas.microsoft.com/office/drawing/2015/10/21/chartex" xmlns:cx3="http://schemas.microsoft.com/office/drawing/2016/5/9/chartex" xmlns:cx4="http://schemas.microsoft.com/office/drawing/2016/5/10/chartex" xmlns:cx5="http://schemas.microsoft.com/office/drawing/2016/5/11/chartex" xmlns:cx6="http://schemas.microsoft.com/office/drawing/2016/5/12/chartex" xmlns:cx7="http://schemas.microsoft.com/office/drawing/2016/5/13/chartex" xmlns:cx8="http://schemas.microsoft.com/office/drawing/2016/5/14/chartex" xmlns:mc="http://schemas.openxmlformats.org/markup-compatibility/2006" xmlns:aink="http://schemas.microsoft.com/office/drawing/2016/ink" xmlns:am3d="http://schemas.microsoft.com/office/drawing/2017/model3d" xmlns:o="urn:schemas-microsoft-com:office:office" xmlns:oel="http://schemas.microsoft.com/office/2019/extlst" xmlns:r="http://schemas.openxmlformats.org/officeDocument/2006/relationships" xmlns:m="http://schemas.openxmlformats.org/officeDocument/2006/math" xmlns:v="urn:schemas-microsoft-com:vml" xmlns:wp14="http://schemas.microsoft.com/office/word/2010/wordprocessingDrawing" xmlns:wp="http://schemas.openxmlformats.org/drawingml/2006/wordprocessingDrawing" xmlns:w10="urn:schemas-microsoft-com:office:word" xmlns:w="http://schemas.openxmlformats.org/wordprocessingml/2006/main" xmlns:w14="http://schemas.microsoft.com/office/word/2010/wordml" xmlns:w15="http://schemas.microsoft.com/office/word/2012/wordml" xmlns:w16cei="http://schemas.microsoft.com/office/word/2026/wordml/cei" xmlns:w16cex="http://schemas.microsoft.com/office/word/2018/wordml/cex" xmlns:w16cid="http://schemas.microsoft.com/office/word/2016/wordml/cid" xmlns:w16="http://schemas.microsoft.com/office/word/2018/wordml" xmlns:w16du="http://schemas.microsoft.com/office/word/2023/wordml/word16du" xmlns:w16sdtdh="http://schemas.microsoft.com/office/word/2020/wordml/sdtdatahash" xmlns:w16sdtfl="http://schemas.microsoft.com/office/word/2024/wordml/sdtformatlock" xmlns:w16se="http://schemas.microsoft.com/office/word/2015/wordml/symex" xmlns:wpg="http://schemas.microsoft.com/office/word/2010/wordprocessingGroup" xmlns:wpi="http://schemas.microsoft.com/office/word/2010/wordprocessingInk" xmlns:wne="http://schemas.microsoft.com/office/word/2006/wordml" xmlns:wps="http://schemas.microsoft.com/office/word/2010/wordprocessingShape" mc:Ignorable="w14 w15 w16se w16cid w16 w16cex w16sdtdh w16sdtfl w16du wp14">
   <w:body>
     <w:p>
-      <w:proofErr w:type="spellStart"/>
-      <w:r>
-        <w:t>Doordash</w:t>
-      </w:r>
-      <w:proofErr w:type="spellEnd"/>
-      <w:r>
-        <w:t xml:space="preserve"> Performance </w:t>
+      <w:r>
+        <w:t xml:space="preserve">Doordash Performance </w:t>
       </w:r>
     </w:p>
     <w:p>
@@ -27,20 +22,56 @@
     </w:p>
     <w:p>
       <w:r>
-        <w:t xml:space="preserve">While I was working on my project, a guy named Jay, also a </w:t>
-      </w:r>
-      <w:proofErr w:type="spellStart"/>
-      <w:r>
-        <w:t>doordash</w:t>
-      </w:r>
-      <w:proofErr w:type="spellEnd"/>
-      <w:r>
-        <w:t xml:space="preserve">/uber eats hustler, picked my brain about my dashboard. We talked about my project for a bit and I explained how my strategy allowed me to make more money with less time on the road. </w:t>
-      </w:r>
-    </w:p>
-    <w:p>
-      <w:r>
-        <w:t xml:space="preserve">I’m almost done with dashboard. </w:t>
+        <w:t xml:space="preserve">While I was working on my project, a guy named Jay, also a doordash/uber eats hustler, picked my brain about my dashboard. We talked about my project for a bit and I explained how my strategy allowed me to make more money with less time on the road. </w:t>
+      </w:r>
+    </w:p>
+    <w:p>
+      <w:r>
+        <w:t>I’</w:t>
+      </w:r>
+      <w:r>
+        <w:t xml:space="preserve">ve completed the dashboard. </w:t>
+      </w:r>
+    </w:p>
+    <w:p>
+      <w:r>
+        <w:t>Now I can move on to the next phases:</w:t>
+      </w:r>
+    </w:p>
+    <w:p>
+      <w:pPr>
+        <w:pStyle w:val="ListParagraph"/>
+        <w:numPr>
+          <w:ilvl w:val="0"/>
+          <w:numId w:val="9"/>
+        </w:numPr>
+      </w:pPr>
+      <w:r>
+        <w:t>Updating and revising the README.md for each project for accuracy</w:t>
+      </w:r>
+    </w:p>
+    <w:p>
+      <w:pPr>
+        <w:pStyle w:val="ListParagraph"/>
+        <w:numPr>
+          <w:ilvl w:val="0"/>
+          <w:numId w:val="9"/>
+        </w:numPr>
+      </w:pPr>
+      <w:r>
+        <w:t>Create a canva presentation for each project</w:t>
+      </w:r>
+    </w:p>
+    <w:p>
+      <w:pPr>
+        <w:pStyle w:val="ListParagraph"/>
+        <w:numPr>
+          <w:ilvl w:val="0"/>
+          <w:numId w:val="9"/>
+        </w:numPr>
+      </w:pPr>
+      <w:r>
+        <w:t>Update Resume and Linked with links to Git Hub portfolio projects and Canva presentations</w:t>
       </w:r>
     </w:p>
     <w:p>
@@ -318,6 +349,7 @@
         </w:numPr>
       </w:pPr>
       <w:r>
+        <w:lastRenderedPageBreak/>
         <w:t>Open Schedule: $</w:t>
       </w:r>
       <w:r>
@@ -440,7 +472,6 @@
         </w:numPr>
       </w:pPr>
       <w:r>
-        <w:lastRenderedPageBreak/>
         <w:t>Shows me improved adherence to rule and how it could affect overall earnings over time.</w:t>
       </w:r>
     </w:p>
@@ -666,6 +697,7 @@
         </w:numPr>
       </w:pPr>
       <w:r>
+        <w:lastRenderedPageBreak/>
         <w:t xml:space="preserve">Certain </w:t>
       </w:r>
       <w:r>
@@ -720,7 +752,6 @@
         </w:numPr>
       </w:pPr>
       <w:r>
-        <w:lastRenderedPageBreak/>
         <w:t>Line graph showing gross earnings over time</w:t>
       </w:r>
     </w:p>
@@ -886,15 +917,7 @@
         </w:numPr>
       </w:pPr>
       <w:r>
-        <w:t xml:space="preserve">Have PDFs of each of the three </w:t>
-      </w:r>
-      <w:proofErr w:type="spellStart"/>
-      <w:r>
-        <w:t>PowerBi</w:t>
-      </w:r>
-      <w:proofErr w:type="spellEnd"/>
-      <w:r>
-        <w:t xml:space="preserve"> projects/files</w:t>
+        <w:t>Have PDFs of each of the three PowerBi projects/files</w:t>
       </w:r>
     </w:p>
     <w:p>
@@ -906,23 +929,7 @@
         </w:numPr>
       </w:pPr>
       <w:r>
-        <w:t xml:space="preserve">Create </w:t>
-      </w:r>
-      <w:proofErr w:type="spellStart"/>
-      <w:r>
-        <w:t>canva</w:t>
-      </w:r>
-      <w:proofErr w:type="spellEnd"/>
-      <w:r>
-        <w:t xml:space="preserve"> and </w:t>
-      </w:r>
-      <w:proofErr w:type="spellStart"/>
-      <w:r>
-        <w:t>powerpoint</w:t>
-      </w:r>
-      <w:proofErr w:type="spellEnd"/>
-      <w:r>
-        <w:t xml:space="preserve"> presentations on each project </w:t>
+        <w:t xml:space="preserve">Create canva and powerpoint presentations on each project </w:t>
       </w:r>
     </w:p>
     <w:p>
@@ -946,6 +953,7 @@
         </w:numPr>
       </w:pPr>
       <w:r>
+        <w:lastRenderedPageBreak/>
         <w:t>Update LinkedIn with new resume, GitHub and Canva links</w:t>
       </w:r>
     </w:p>
@@ -1001,7 +1009,6 @@
         </w:numPr>
       </w:pPr>
       <w:r>
-        <w:lastRenderedPageBreak/>
         <w:t>What hours of the day do I make more money?</w:t>
       </w:r>
     </w:p>
@@ -1250,15 +1257,7 @@
         <w:t>ed</w:t>
       </w:r>
       <w:r>
-        <w:t xml:space="preserve"> synthetic dataset that mirrors my </w:t>
-      </w:r>
-      <w:proofErr w:type="spellStart"/>
-      <w:r>
-        <w:t>Doordash</w:t>
-      </w:r>
-      <w:proofErr w:type="spellEnd"/>
-      <w:r>
-        <w:t xml:space="preserve"> experiences and self-analysis from 11/2025-7/2026.</w:t>
+        <w:t xml:space="preserve"> synthetic dataset that mirrors my Doordash experiences and self-analysis from 11/2025-7/2026.</w:t>
       </w:r>
       <w:r>
         <w:t xml:space="preserve"> </w:t>
@@ -1420,6 +1419,119 @@
     </w:lvl>
   </w:abstractNum>
   <w:abstractNum w:abstractNumId="1" w15:restartNumberingAfterBreak="0">
+    <w:nsid w:val="0D8604BB"/>
+    <w:multiLevelType w:val="hybridMultilevel"/>
+    <w:tmpl w:val="7248B158"/>
+    <w:lvl w:ilvl="0" w:tplc="04090001">
+      <w:start w:val="1"/>
+      <w:numFmt w:val="bullet"/>
+      <w:lvlText w:val=""/>
+      <w:lvlJc w:val="left"/>
+      <w:pPr>
+        <w:ind w:left="720" w:hanging="360"/>
+      </w:pPr>
+      <w:rPr>
+        <w:rFonts w:ascii="Symbol" w:hAnsi="Symbol" w:hint="default"/>
+      </w:rPr>
+    </w:lvl>
+    <w:lvl w:ilvl="1" w:tplc="04090003" w:tentative="1">
+      <w:start w:val="1"/>
+      <w:numFmt w:val="bullet"/>
+      <w:lvlText w:val="o"/>
+      <w:lvlJc w:val="left"/>
+      <w:pPr>
+        <w:ind w:left="1440" w:hanging="360"/>
+      </w:pPr>
+      <w:rPr>
+        <w:rFonts w:ascii="Courier New" w:hAnsi="Courier New" w:cs="Courier New" w:hint="default"/>
+      </w:rPr>
+    </w:lvl>
+    <w:lvl w:ilvl="2" w:tplc="04090005" w:tentative="1">
+      <w:start w:val="1"/>
+      <w:numFmt w:val="bullet"/>
+      <w:lvlText w:val=""/>
+      <w:lvlJc w:val="left"/>
+      <w:pPr>
+        <w:ind w:left="2160" w:hanging="360"/>
+      </w:pPr>
+      <w:rPr>
+        <w:rFonts w:ascii="Wingdings" w:hAnsi="Wingdings" w:hint="default"/>
+      </w:rPr>
+    </w:lvl>
+    <w:lvl w:ilvl="3" w:tplc="04090001" w:tentative="1">
+      <w:start w:val="1"/>
+      <w:numFmt w:val="bullet"/>
+      <w:lvlText w:val=""/>
+      <w:lvlJc w:val="left"/>
+      <w:pPr>
+        <w:ind w:left="2880" w:hanging="360"/>
+      </w:pPr>
+      <w:rPr>
+        <w:rFonts w:ascii="Symbol" w:hAnsi="Symbol" w:hint="default"/>
+      </w:rPr>
+    </w:lvl>
+    <w:lvl w:ilvl="4" w:tplc="04090003" w:tentative="1">
+      <w:start w:val="1"/>
+      <w:numFmt w:val="bullet"/>
+      <w:lvlText w:val="o"/>
+      <w:lvlJc w:val="left"/>
+      <w:pPr>
+        <w:ind w:left="3600" w:hanging="360"/>
+      </w:pPr>
+      <w:rPr>
+        <w:rFonts w:ascii="Courier New" w:hAnsi="Courier New" w:cs="Courier New" w:hint="default"/>
+      </w:rPr>
+    </w:lvl>
+    <w:lvl w:ilvl="5" w:tplc="04090005" w:tentative="1">
+      <w:start w:val="1"/>
+      <w:numFmt w:val="bullet"/>
+      <w:lvlText w:val=""/>
+      <w:lvlJc w:val="left"/>
+      <w:pPr>
+        <w:ind w:left="4320" w:hanging="360"/>
+      </w:pPr>
+      <w:rPr>
+        <w:rFonts w:ascii="Wingdings" w:hAnsi="Wingdings" w:hint="default"/>
+      </w:rPr>
+    </w:lvl>
+    <w:lvl w:ilvl="6" w:tplc="04090001" w:tentative="1">
+      <w:start w:val="1"/>
+      <w:numFmt w:val="bullet"/>
+      <w:lvlText w:val=""/>
+      <w:lvlJc w:val="left"/>
+      <w:pPr>
+        <w:ind w:left="5040" w:hanging="360"/>
+      </w:pPr>
+      <w:rPr>
+        <w:rFonts w:ascii="Symbol" w:hAnsi="Symbol" w:hint="default"/>
+      </w:rPr>
+    </w:lvl>
+    <w:lvl w:ilvl="7" w:tplc="04090003" w:tentative="1">
+      <w:start w:val="1"/>
+      <w:numFmt w:val="bullet"/>
+      <w:lvlText w:val="o"/>
+      <w:lvlJc w:val="left"/>
+      <w:pPr>
+        <w:ind w:left="5760" w:hanging="360"/>
+      </w:pPr>
+      <w:rPr>
+        <w:rFonts w:ascii="Courier New" w:hAnsi="Courier New" w:cs="Courier New" w:hint="default"/>
+      </w:rPr>
+    </w:lvl>
+    <w:lvl w:ilvl="8" w:tplc="04090005" w:tentative="1">
+      <w:start w:val="1"/>
+      <w:numFmt w:val="bullet"/>
+      <w:lvlText w:val=""/>
+      <w:lvlJc w:val="left"/>
+      <w:pPr>
+        <w:ind w:left="6480" w:hanging="360"/>
+      </w:pPr>
+      <w:rPr>
+        <w:rFonts w:ascii="Wingdings" w:hAnsi="Wingdings" w:hint="default"/>
+      </w:rPr>
+    </w:lvl>
+  </w:abstractNum>
+  <w:abstractNum w:abstractNumId="2" w15:restartNumberingAfterBreak="0">
     <w:nsid w:val="1E671E4E"/>
     <w:multiLevelType w:val="hybridMultilevel"/>
     <w:tmpl w:val="8D7C6FB6"/>
@@ -1532,7 +1644,7 @@
       </w:rPr>
     </w:lvl>
   </w:abstractNum>
-  <w:abstractNum w:abstractNumId="2" w15:restartNumberingAfterBreak="0">
+  <w:abstractNum w:abstractNumId="3" w15:restartNumberingAfterBreak="0">
     <w:nsid w:val="37D23C18"/>
     <w:multiLevelType w:val="hybridMultilevel"/>
     <w:tmpl w:val="4C8883E0"/>
@@ -1645,7 +1757,7 @@
       </w:rPr>
     </w:lvl>
   </w:abstractNum>
-  <w:abstractNum w:abstractNumId="3" w15:restartNumberingAfterBreak="0">
+  <w:abstractNum w:abstractNumId="4" w15:restartNumberingAfterBreak="0">
     <w:nsid w:val="516F60DE"/>
     <w:multiLevelType w:val="hybridMultilevel"/>
     <w:tmpl w:val="E744E2EA"/>
@@ -1758,7 +1870,7 @@
       </w:rPr>
     </w:lvl>
   </w:abstractNum>
-  <w:abstractNum w:abstractNumId="4" w15:restartNumberingAfterBreak="0">
+  <w:abstractNum w:abstractNumId="5" w15:restartNumberingAfterBreak="0">
     <w:nsid w:val="617B0A26"/>
     <w:multiLevelType w:val="hybridMultilevel"/>
     <w:tmpl w:val="E5FC9042"/>
@@ -1871,7 +1983,7 @@
       </w:rPr>
     </w:lvl>
   </w:abstractNum>
-  <w:abstractNum w:abstractNumId="5" w15:restartNumberingAfterBreak="0">
+  <w:abstractNum w:abstractNumId="6" w15:restartNumberingAfterBreak="0">
     <w:nsid w:val="6FE279BA"/>
     <w:multiLevelType w:val="hybridMultilevel"/>
     <w:tmpl w:val="5D3A03EC"/>
@@ -1984,7 +2096,7 @@
       </w:rPr>
     </w:lvl>
   </w:abstractNum>
-  <w:abstractNum w:abstractNumId="6" w15:restartNumberingAfterBreak="0">
+  <w:abstractNum w:abstractNumId="7" w15:restartNumberingAfterBreak="0">
     <w:nsid w:val="724C22D9"/>
     <w:multiLevelType w:val="hybridMultilevel"/>
     <w:tmpl w:val="2A66E762"/>
@@ -2097,7 +2209,7 @@
       </w:rPr>
     </w:lvl>
   </w:abstractNum>
-  <w:abstractNum w:abstractNumId="7" w15:restartNumberingAfterBreak="0">
+  <w:abstractNum w:abstractNumId="8" w15:restartNumberingAfterBreak="0">
     <w:nsid w:val="738213FA"/>
     <w:multiLevelType w:val="hybridMultilevel"/>
     <w:tmpl w:val="8996C4B4"/>
@@ -2211,27 +2323,30 @@
     </w:lvl>
   </w:abstractNum>
   <w:num w:numId="1" w16cid:durableId="512917471">
-    <w:abstractNumId w:val="5"/>
+    <w:abstractNumId w:val="6"/>
   </w:num>
   <w:num w:numId="2" w16cid:durableId="1753311224">
-    <w:abstractNumId w:val="3"/>
+    <w:abstractNumId w:val="4"/>
   </w:num>
   <w:num w:numId="3" w16cid:durableId="1444612632">
-    <w:abstractNumId w:val="6"/>
+    <w:abstractNumId w:val="7"/>
   </w:num>
   <w:num w:numId="4" w16cid:durableId="1543252395">
-    <w:abstractNumId w:val="2"/>
+    <w:abstractNumId w:val="3"/>
   </w:num>
   <w:num w:numId="5" w16cid:durableId="52781899">
     <w:abstractNumId w:val="0"/>
   </w:num>
   <w:num w:numId="6" w16cid:durableId="774328264">
-    <w:abstractNumId w:val="4"/>
+    <w:abstractNumId w:val="5"/>
   </w:num>
   <w:num w:numId="7" w16cid:durableId="902790525">
-    <w:abstractNumId w:val="7"/>
+    <w:abstractNumId w:val="8"/>
   </w:num>
   <w:num w:numId="8" w16cid:durableId="1181427494">
+    <w:abstractNumId w:val="2"/>
+  </w:num>
+  <w:num w:numId="9" w16cid:durableId="1543445408">
     <w:abstractNumId w:val="1"/>
   </w:num>
 </w:numbering>

</xml_diff>